<commit_message>
Je suis deja un devOps
</commit_message>
<xml_diff>
--- a/rapports/Rapport d'analyse exploratoire.docx
+++ b/rapports/Rapport d'analyse exploratoire.docx
@@ -12,376 +12,38 @@
           <w:lang w:val="fr-FR"/>
         </w:rPr>
       </w:pPr>
-      <w:r>
-        <w:rPr>
-          <w:noProof/>
+    </w:p>
+    <w:p>
+      <w:pPr>
+        <w:jc w:val="center"/>
+        <w:rPr>
           <w:sz w:val="36"/>
           <w:szCs w:val="36"/>
           <w:u w:val="single"/>
-        </w:rPr>
-        <mc:AlternateContent>
-          <mc:Choice Requires="wps">
-            <w:drawing>
-              <wp:anchor distT="0" distB="0" distL="114300" distR="114300" simplePos="0" relativeHeight="251659264" behindDoc="0" locked="0" layoutInCell="1" allowOverlap="1" wp14:anchorId="5B2DD036" wp14:editId="07998E6C">
-                <wp:simplePos x="0" y="0"/>
-                <wp:positionH relativeFrom="margin">
-                  <wp:align>left</wp:align>
-                </wp:positionH>
-                <wp:positionV relativeFrom="paragraph">
-                  <wp:posOffset>13797</wp:posOffset>
-                </wp:positionV>
-                <wp:extent cx="5971309" cy="1267691"/>
-                <wp:effectExtent l="0" t="0" r="10795" b="27940"/>
-                <wp:wrapNone/>
-                <wp:docPr id="4" name="Organigramme : Alternative 4"/>
-                <wp:cNvGraphicFramePr/>
-                <a:graphic xmlns:a="http://schemas.openxmlformats.org/drawingml/2006/main">
-                  <a:graphicData uri="http://schemas.microsoft.com/office/word/2010/wordprocessingShape">
-                    <wps:wsp>
-                      <wps:cNvSpPr/>
-                      <wps:spPr>
-                        <a:xfrm>
-                          <a:off x="0" y="0"/>
-                          <a:ext cx="5971309" cy="1267691"/>
-                        </a:xfrm>
-                        <a:prstGeom prst="flowChartAlternateProcess">
-                          <a:avLst/>
-                        </a:prstGeom>
-                        <a:solidFill>
-                          <a:schemeClr val="bg1"/>
-                        </a:solidFill>
-                        <a:ln>
-                          <a:solidFill>
-                            <a:schemeClr val="tx1"/>
-                          </a:solidFill>
-                        </a:ln>
-                      </wps:spPr>
-                      <wps:style>
-                        <a:lnRef idx="2">
-                          <a:schemeClr val="accent1">
-                            <a:shade val="50000"/>
-                          </a:schemeClr>
-                        </a:lnRef>
-                        <a:fillRef idx="1">
-                          <a:schemeClr val="accent1"/>
-                        </a:fillRef>
-                        <a:effectRef idx="0">
-                          <a:schemeClr val="accent1"/>
-                        </a:effectRef>
-                        <a:fontRef idx="minor">
-                          <a:schemeClr val="lt1"/>
-                        </a:fontRef>
-                      </wps:style>
-                      <wps:txbx>
-                        <w:txbxContent>
-                          <w:p>
-                            <w:pPr>
-                              <w:rPr>
-                                <w:color w:val="000000" w:themeColor="text1"/>
-                                <w14:shadow w14:blurRad="38100" w14:dist="19050" w14:dir="2700000" w14:sx="100000" w14:sy="100000" w14:kx="0" w14:ky="0" w14:algn="tl">
-                                  <w14:schemeClr w14:val="dk1">
-                                    <w14:alpha w14:val="60000"/>
-                                  </w14:schemeClr>
-                                </w14:shadow>
-                                <w14:textOutline w14:w="0" w14:cap="flat" w14:cmpd="sng" w14:algn="ctr">
-                                  <w14:noFill/>
-                                  <w14:prstDash w14:val="solid"/>
-                                  <w14:round/>
-                                </w14:textOutline>
-                              </w:rPr>
-                            </w:pPr>
-                            <w:r>
-                              <w:rPr>
-                                <w:noProof/>
-                                <w:color w:val="000000" w:themeColor="text1"/>
-                              </w:rPr>
-                              <w:drawing>
-                                <wp:inline distT="0" distB="0" distL="0" distR="0" wp14:anchorId="1DA4671B" wp14:editId="47142F3B">
-                                  <wp:extent cx="1269365" cy="995680"/>
-                                  <wp:effectExtent l="0" t="0" r="6985" b="0"/>
-                                  <wp:docPr id="9" name="Image 9"/>
-                                  <wp:cNvGraphicFramePr>
-                                    <a:graphicFrameLocks xmlns:a="http://schemas.openxmlformats.org/drawingml/2006/main" noChangeAspect="1"/>
-                                  </wp:cNvGraphicFramePr>
-                                  <a:graphic xmlns:a="http://schemas.openxmlformats.org/drawingml/2006/main">
-                                    <a:graphicData uri="http://schemas.openxmlformats.org/drawingml/2006/picture">
-                                      <pic:pic xmlns:pic="http://schemas.openxmlformats.org/drawingml/2006/picture">
-                                        <pic:nvPicPr>
-                                          <pic:cNvPr id="9" name="images.jpeg"/>
-                                          <pic:cNvPicPr/>
-                                        </pic:nvPicPr>
-                                        <pic:blipFill>
-                                          <a:blip r:embed="rId7">
-                                            <a:extLst>
-                                              <a:ext uri="{28A0092B-C50C-407E-A947-70E740481C1C}">
-                                                <a14:useLocalDpi xmlns:a14="http://schemas.microsoft.com/office/drawing/2010/main" val="0"/>
-                                              </a:ext>
-                                            </a:extLst>
-                                          </a:blip>
-                                          <a:stretch>
-                                            <a:fillRect/>
-                                          </a:stretch>
-                                        </pic:blipFill>
-                                        <pic:spPr>
-                                          <a:xfrm>
-                                            <a:off x="0" y="0"/>
-                                            <a:ext cx="1269365" cy="995680"/>
-                                          </a:xfrm>
-                                          <a:prstGeom prst="rect">
-                                            <a:avLst/>
-                                          </a:prstGeom>
-                                        </pic:spPr>
-                                      </pic:pic>
-                                    </a:graphicData>
-                                  </a:graphic>
-                                </wp:inline>
-                              </w:drawing>
-                            </w:r>
-                            <w:r>
-                              <w:rPr>
-                                <w:color w:val="000000" w:themeColor="text1"/>
-                                <w14:shadow w14:blurRad="38100" w14:dist="19050" w14:dir="2700000" w14:sx="100000" w14:sy="100000" w14:kx="0" w14:ky="0" w14:algn="tl">
-                                  <w14:schemeClr w14:val="dk1">
-                                    <w14:alpha w14:val="60000"/>
-                                  </w14:schemeClr>
-                                </w14:shadow>
-                                <w14:textOutline w14:w="0" w14:cap="flat" w14:cmpd="sng" w14:algn="ctr">
-                                  <w14:noFill/>
-                                  <w14:prstDash w14:val="solid"/>
-                                  <w14:round/>
-                                </w14:textOutline>
-                              </w:rPr>
-                              <w:t xml:space="preserve"> </w:t>
-                            </w:r>
-                          </w:p>
-                          <w:p>
-                            <w:pPr>
-                              <w:rPr>
-                                <w:color w:val="000000" w:themeColor="text1"/>
-                                <w14:shadow w14:blurRad="38100" w14:dist="19050" w14:dir="2700000" w14:sx="100000" w14:sy="100000" w14:kx="0" w14:ky="0" w14:algn="tl">
-                                  <w14:schemeClr w14:val="dk1">
-                                    <w14:alpha w14:val="60000"/>
-                                  </w14:schemeClr>
-                                </w14:shadow>
-                                <w14:textOutline w14:w="0" w14:cap="flat" w14:cmpd="sng" w14:algn="ctr">
-                                  <w14:noFill/>
-                                  <w14:prstDash w14:val="solid"/>
-                                  <w14:round/>
-                                </w14:textOutline>
-                              </w:rPr>
-                            </w:pPr>
-                          </w:p>
-                          <w:p>
-                            <w:pPr>
-                              <w:rPr>
-                                <w:color w:val="000000" w:themeColor="text1"/>
-                                <w14:shadow w14:blurRad="38100" w14:dist="19050" w14:dir="2700000" w14:sx="100000" w14:sy="100000" w14:kx="0" w14:ky="0" w14:algn="tl">
-                                  <w14:schemeClr w14:val="dk1">
-                                    <w14:alpha w14:val="60000"/>
-                                  </w14:schemeClr>
-                                </w14:shadow>
-                                <w14:textOutline w14:w="0" w14:cap="flat" w14:cmpd="sng" w14:algn="ctr">
-                                  <w14:noFill/>
-                                  <w14:prstDash w14:val="solid"/>
-                                  <w14:round/>
-                                </w14:textOutline>
-                              </w:rPr>
-                            </w:pPr>
-                            <w:r>
-                              <w:rPr>
-                                <w:color w:val="000000" w:themeColor="text1"/>
-                                <w14:shadow w14:blurRad="38100" w14:dist="19050" w14:dir="2700000" w14:sx="100000" w14:sy="100000" w14:kx="0" w14:ky="0" w14:algn="tl">
-                                  <w14:schemeClr w14:val="dk1">
-                                    <w14:alpha w14:val="60000"/>
-                                  </w14:schemeClr>
-                                </w14:shadow>
-                                <w14:textOutline w14:w="0" w14:cap="flat" w14:cmpd="sng" w14:algn="ctr">
-                                  <w14:noFill/>
-                                  <w14:prstDash w14:val="solid"/>
-                                  <w14:round/>
-                                </w14:textOutline>
-                              </w:rPr>
-                              <w:t xml:space="preserve">                                          </w:t>
-                            </w:r>
-                          </w:p>
-                        </w:txbxContent>
-                      </wps:txbx>
-                      <wps:bodyPr rot="0" spcFirstLastPara="0" vertOverflow="overflow" horzOverflow="overflow" vert="horz" wrap="square" lIns="91440" tIns="45720" rIns="91440" bIns="45720" numCol="1" spcCol="0" rtlCol="0" fromWordArt="0" anchor="ctr" anchorCtr="0" forceAA="0" compatLnSpc="1">
-                        <a:prstTxWarp prst="textNoShape">
-                          <a:avLst/>
-                        </a:prstTxWarp>
-                        <a:noAutofit/>
-                      </wps:bodyPr>
-                    </wps:wsp>
-                  </a:graphicData>
-                </a:graphic>
-                <wp14:sizeRelH relativeFrom="margin">
-                  <wp14:pctWidth>0</wp14:pctWidth>
-                </wp14:sizeRelH>
-                <wp14:sizeRelV relativeFrom="margin">
-                  <wp14:pctHeight>0</wp14:pctHeight>
-                </wp14:sizeRelV>
-              </wp:anchor>
-            </w:drawing>
-          </mc:Choice>
-          <mc:Fallback>
-            <w:pict>
-              <v:shapetype w14:anchorId="5B2DD036" id="_x0000_t176" coordsize="21600,21600" o:spt="176" adj="2700" path="m@0,qx0@0l0@2qy@0,21600l@1,21600qx21600@2l21600@0qy@1,xe">
-                <v:stroke joinstyle="miter"/>
-                <v:formulas>
-                  <v:f eqn="val #0"/>
-                  <v:f eqn="sum width 0 #0"/>
-                  <v:f eqn="sum height 0 #0"/>
-                  <v:f eqn="prod @0 2929 10000"/>
-                  <v:f eqn="sum width 0 @3"/>
-                  <v:f eqn="sum height 0 @3"/>
-                  <v:f eqn="val width"/>
-                  <v:f eqn="val height"/>
-                  <v:f eqn="prod width 1 2"/>
-                  <v:f eqn="prod height 1 2"/>
-                </v:formulas>
-                <v:path gradientshapeok="t" limo="10800,10800" o:connecttype="custom" o:connectlocs="@8,0;0,@9;@8,@7;@6,@9" textboxrect="@3,@3,@4,@5"/>
-              </v:shapetype>
-              <v:shape id="Organigramme : Alternative 4" o:spid="_x0000_s1026" type="#_x0000_t176" style="position:absolute;left:0;text-align:left;margin-left:0;margin-top:1.1pt;width:470.2pt;height:99.8pt;z-index:251659264;visibility:visible;mso-wrap-style:square;mso-width-percent:0;mso-height-percent:0;mso-wrap-distance-left:9pt;mso-wrap-distance-top:0;mso-wrap-distance-right:9pt;mso-wrap-distance-bottom:0;mso-position-horizontal:left;mso-position-horizontal-relative:margin;mso-position-vertical:absolute;mso-position-vertical-relative:text;mso-width-percent:0;mso-height-percent:0;mso-width-relative:margin;mso-height-relative:margin;v-text-anchor:middle" o:gfxdata="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" fillcolor="white [3212]" strokecolor="black [3213]" strokeweight="1pt">
-                <v:textbox>
-                  <w:txbxContent>
-                    <w:p>
-                      <w:pPr>
-                        <w:rPr>
-                          <w:color w:val="000000" w:themeColor="text1"/>
-                          <w14:shadow w14:blurRad="38100" w14:dist="19050" w14:dir="2700000" w14:sx="100000" w14:sy="100000" w14:kx="0" w14:ky="0" w14:algn="tl">
-                            <w14:schemeClr w14:val="dk1">
-                              <w14:alpha w14:val="60000"/>
-                            </w14:schemeClr>
-                          </w14:shadow>
-                          <w14:textOutline w14:w="0" w14:cap="flat" w14:cmpd="sng" w14:algn="ctr">
-                            <w14:noFill/>
-                            <w14:prstDash w14:val="solid"/>
-                            <w14:round/>
-                          </w14:textOutline>
-                        </w:rPr>
-                      </w:pPr>
-                      <w:r>
-                        <w:rPr>
-                          <w:noProof/>
-                          <w:color w:val="000000" w:themeColor="text1"/>
-                        </w:rPr>
-                        <w:drawing>
-                          <wp:inline distT="0" distB="0" distL="0" distR="0" wp14:anchorId="1DA4671B" wp14:editId="47142F3B">
-                            <wp:extent cx="1269365" cy="995680"/>
-                            <wp:effectExtent l="0" t="0" r="6985" b="0"/>
-                            <wp:docPr id="9" name="Image 9"/>
-                            <wp:cNvGraphicFramePr>
-                              <a:graphicFrameLocks xmlns:a="http://schemas.openxmlformats.org/drawingml/2006/main" noChangeAspect="1"/>
-                            </wp:cNvGraphicFramePr>
-                            <a:graphic xmlns:a="http://schemas.openxmlformats.org/drawingml/2006/main">
-                              <a:graphicData uri="http://schemas.openxmlformats.org/drawingml/2006/picture">
-                                <pic:pic xmlns:pic="http://schemas.openxmlformats.org/drawingml/2006/picture">
-                                  <pic:nvPicPr>
-                                    <pic:cNvPr id="9" name="images.jpeg"/>
-                                    <pic:cNvPicPr/>
-                                  </pic:nvPicPr>
-                                  <pic:blipFill>
-                                    <a:blip r:embed="rId7">
-                                      <a:extLst>
-                                        <a:ext uri="{28A0092B-C50C-407E-A947-70E740481C1C}">
-                                          <a14:useLocalDpi xmlns:a14="http://schemas.microsoft.com/office/drawing/2010/main" val="0"/>
-                                        </a:ext>
-                                      </a:extLst>
-                                    </a:blip>
-                                    <a:stretch>
-                                      <a:fillRect/>
-                                    </a:stretch>
-                                  </pic:blipFill>
-                                  <pic:spPr>
-                                    <a:xfrm>
-                                      <a:off x="0" y="0"/>
-                                      <a:ext cx="1269365" cy="995680"/>
-                                    </a:xfrm>
-                                    <a:prstGeom prst="rect">
-                                      <a:avLst/>
-                                    </a:prstGeom>
-                                  </pic:spPr>
-                                </pic:pic>
-                              </a:graphicData>
-                            </a:graphic>
-                          </wp:inline>
-                        </w:drawing>
-                      </w:r>
-                      <w:r>
-                        <w:rPr>
-                          <w:color w:val="000000" w:themeColor="text1"/>
-                          <w14:shadow w14:blurRad="38100" w14:dist="19050" w14:dir="2700000" w14:sx="100000" w14:sy="100000" w14:kx="0" w14:ky="0" w14:algn="tl">
-                            <w14:schemeClr w14:val="dk1">
-                              <w14:alpha w14:val="60000"/>
-                            </w14:schemeClr>
-                          </w14:shadow>
-                          <w14:textOutline w14:w="0" w14:cap="flat" w14:cmpd="sng" w14:algn="ctr">
-                            <w14:noFill/>
-                            <w14:prstDash w14:val="solid"/>
-                            <w14:round/>
-                          </w14:textOutline>
-                        </w:rPr>
-                        <w:t xml:space="preserve"> </w:t>
-                      </w:r>
-                    </w:p>
-                    <w:p>
-                      <w:pPr>
-                        <w:rPr>
-                          <w:color w:val="000000" w:themeColor="text1"/>
-                          <w14:shadow w14:blurRad="38100" w14:dist="19050" w14:dir="2700000" w14:sx="100000" w14:sy="100000" w14:kx="0" w14:ky="0" w14:algn="tl">
-                            <w14:schemeClr w14:val="dk1">
-                              <w14:alpha w14:val="60000"/>
-                            </w14:schemeClr>
-                          </w14:shadow>
-                          <w14:textOutline w14:w="0" w14:cap="flat" w14:cmpd="sng" w14:algn="ctr">
-                            <w14:noFill/>
-                            <w14:prstDash w14:val="solid"/>
-                            <w14:round/>
-                          </w14:textOutline>
-                        </w:rPr>
-                      </w:pPr>
-                    </w:p>
-                    <w:p>
-                      <w:pPr>
-                        <w:rPr>
-                          <w:color w:val="000000" w:themeColor="text1"/>
-                          <w14:shadow w14:blurRad="38100" w14:dist="19050" w14:dir="2700000" w14:sx="100000" w14:sy="100000" w14:kx="0" w14:ky="0" w14:algn="tl">
-                            <w14:schemeClr w14:val="dk1">
-                              <w14:alpha w14:val="60000"/>
-                            </w14:schemeClr>
-                          </w14:shadow>
-                          <w14:textOutline w14:w="0" w14:cap="flat" w14:cmpd="sng" w14:algn="ctr">
-                            <w14:noFill/>
-                            <w14:prstDash w14:val="solid"/>
-                            <w14:round/>
-                          </w14:textOutline>
-                        </w:rPr>
-                      </w:pPr>
-                      <w:r>
-                        <w:rPr>
-                          <w:color w:val="000000" w:themeColor="text1"/>
-                          <w14:shadow w14:blurRad="38100" w14:dist="19050" w14:dir="2700000" w14:sx="100000" w14:sy="100000" w14:kx="0" w14:ky="0" w14:algn="tl">
-                            <w14:schemeClr w14:val="dk1">
-                              <w14:alpha w14:val="60000"/>
-                            </w14:schemeClr>
-                          </w14:shadow>
-                          <w14:textOutline w14:w="0" w14:cap="flat" w14:cmpd="sng" w14:algn="ctr">
-                            <w14:noFill/>
-                            <w14:prstDash w14:val="solid"/>
-                            <w14:round/>
-                          </w14:textOutline>
-                        </w:rPr>
-                        <w:t xml:space="preserve">                                          </w:t>
-                      </w:r>
-                    </w:p>
-                  </w:txbxContent>
-                </v:textbox>
-                <w10:wrap anchorx="margin"/>
-              </v:shape>
-            </w:pict>
-          </mc:Fallback>
-        </mc:AlternateContent>
+          <w:lang w:val="fr-FR"/>
+        </w:rPr>
+      </w:pPr>
+      <w:bookmarkStart w:id="0" w:name="_GoBack"/>
+      <w:bookmarkEnd w:id="0"/>
+    </w:p>
+    <w:p>
+      <w:pPr>
+        <w:jc w:val="center"/>
+        <w:rPr>
+          <w:b/>
+          <w:sz w:val="44"/>
+          <w:szCs w:val="44"/>
+          <w:lang w:val="fr-FR"/>
+        </w:rPr>
+      </w:pPr>
+      <w:r>
+        <w:rPr>
+          <w:b/>
+          <w:sz w:val="44"/>
+          <w:szCs w:val="44"/>
+          <w:lang w:val="fr-FR"/>
+        </w:rPr>
+        <w:t>Formation analyse de données avec python</w:t>
       </w:r>
     </w:p>
     <w:p>
@@ -399,6 +61,48 @@
       <w:pPr>
         <w:jc w:val="center"/>
         <w:rPr>
+          <w:sz w:val="28"/>
+          <w:szCs w:val="28"/>
+          <w:u w:val="single"/>
+          <w:lang w:val="fr-FR"/>
+        </w:rPr>
+      </w:pPr>
+    </w:p>
+    <w:p>
+      <w:pPr>
+        <w:jc w:val="center"/>
+        <w:rPr>
+          <w:sz w:val="28"/>
+          <w:szCs w:val="28"/>
+          <w:u w:val="single"/>
+          <w:lang w:val="fr-FR"/>
+        </w:rPr>
+      </w:pPr>
+      <w:r>
+        <w:rPr>
+          <w:sz w:val="28"/>
+          <w:szCs w:val="28"/>
+          <w:u w:val="single"/>
+          <w:lang w:val="fr-FR"/>
+        </w:rPr>
+        <w:t>Résumé de l’analyse exploratoire</w:t>
+      </w:r>
+    </w:p>
+    <w:p>
+      <w:pPr>
+        <w:jc w:val="both"/>
+        <w:rPr>
+          <w:sz w:val="28"/>
+          <w:szCs w:val="28"/>
+          <w:u w:val="single"/>
+          <w:lang w:val="fr-FR"/>
+        </w:rPr>
+      </w:pPr>
+    </w:p>
+    <w:p>
+      <w:pPr>
+        <w:jc w:val="center"/>
+        <w:rPr>
           <w:sz w:val="36"/>
           <w:szCs w:val="36"/>
           <w:u w:val="single"/>
@@ -408,92 +112,6 @@
     </w:p>
     <w:p>
       <w:pPr>
-        <w:jc w:val="center"/>
-        <w:rPr>
-          <w:sz w:val="36"/>
-          <w:szCs w:val="36"/>
-          <w:u w:val="single"/>
-          <w:lang w:val="fr-FR"/>
-        </w:rPr>
-      </w:pPr>
-    </w:p>
-    <w:p>
-      <w:pPr>
-        <w:jc w:val="center"/>
-        <w:rPr>
-          <w:sz w:val="36"/>
-          <w:szCs w:val="36"/>
-          <w:u w:val="single"/>
-          <w:lang w:val="fr-FR"/>
-        </w:rPr>
-      </w:pPr>
-    </w:p>
-    <w:p>
-      <w:pPr>
-        <w:jc w:val="center"/>
-        <w:rPr>
-          <w:b/>
-          <w:sz w:val="28"/>
-          <w:szCs w:val="28"/>
-          <w:lang w:val="fr-FR"/>
-        </w:rPr>
-      </w:pPr>
-      <w:r>
-        <w:rPr>
-          <w:b/>
-          <w:sz w:val="28"/>
-          <w:szCs w:val="28"/>
-          <w:lang w:val="fr-FR"/>
-        </w:rPr>
-        <w:t xml:space="preserve">Formation analyse de données avec python </w:t>
-      </w:r>
-    </w:p>
-    <w:p>
-      <w:pPr>
-        <w:jc w:val="center"/>
-        <w:rPr>
-          <w:sz w:val="36"/>
-          <w:szCs w:val="36"/>
-          <w:u w:val="single"/>
-          <w:lang w:val="fr-FR"/>
-        </w:rPr>
-      </w:pPr>
-    </w:p>
-    <w:p>
-      <w:pPr>
-        <w:jc w:val="center"/>
-        <w:rPr>
-          <w:sz w:val="36"/>
-          <w:szCs w:val="36"/>
-          <w:u w:val="single"/>
-          <w:lang w:val="fr-FR"/>
-        </w:rPr>
-      </w:pPr>
-    </w:p>
-    <w:p>
-      <w:pPr>
-        <w:jc w:val="both"/>
-        <w:rPr>
-          <w:sz w:val="28"/>
-          <w:szCs w:val="28"/>
-          <w:u w:val="single"/>
-          <w:lang w:val="fr-FR"/>
-        </w:rPr>
-      </w:pPr>
-    </w:p>
-    <w:p>
-      <w:pPr>
-        <w:jc w:val="center"/>
-        <w:rPr>
-          <w:sz w:val="36"/>
-          <w:szCs w:val="36"/>
-          <w:u w:val="single"/>
-          <w:lang w:val="fr-FR"/>
-        </w:rPr>
-      </w:pPr>
-    </w:p>
-    <w:p>
-      <w:pPr>
         <w:tabs>
           <w:tab w:val="left" w:pos="3000"/>
         </w:tabs>
@@ -505,284 +123,6 @@
         </w:rPr>
       </w:pPr>
     </w:p>
-    <w:tbl>
-      <w:tblPr>
-        <w:tblStyle w:val="Grilledutableau"/>
-        <w:tblpPr w:leftFromText="180" w:rightFromText="180" w:vertAnchor="text" w:horzAnchor="page" w:tblpX="1955" w:tblpY="3723"/>
-        <w:tblW w:w="0" w:type="auto"/>
-        <w:tblLook w:val="04A0" w:firstRow="1" w:lastRow="0" w:firstColumn="1" w:lastColumn="0" w:noHBand="0" w:noVBand="1"/>
-      </w:tblPr>
-      <w:tblGrid>
-        <w:gridCol w:w="2337"/>
-        <w:gridCol w:w="2337"/>
-        <w:gridCol w:w="2338"/>
-        <w:gridCol w:w="2338"/>
-      </w:tblGrid>
-      <w:tr>
-        <w:tc>
-          <w:tcPr>
-            <w:tcW w:w="2337" w:type="dxa"/>
-          </w:tcPr>
-          <w:p>
-            <w:pPr>
-              <w:jc w:val="center"/>
-              <w:rPr>
-                <w:sz w:val="36"/>
-                <w:szCs w:val="36"/>
-                <w:u w:val="single"/>
-                <w:lang w:val="fr-FR"/>
-              </w:rPr>
-            </w:pPr>
-          </w:p>
-        </w:tc>
-        <w:tc>
-          <w:tcPr>
-            <w:tcW w:w="2337" w:type="dxa"/>
-          </w:tcPr>
-          <w:p>
-            <w:pPr>
-              <w:jc w:val="center"/>
-              <w:rPr>
-                <w:sz w:val="36"/>
-                <w:szCs w:val="36"/>
-                <w:u w:val="single"/>
-                <w:lang w:val="fr-FR"/>
-              </w:rPr>
-            </w:pPr>
-          </w:p>
-        </w:tc>
-        <w:tc>
-          <w:tcPr>
-            <w:tcW w:w="2338" w:type="dxa"/>
-          </w:tcPr>
-          <w:p>
-            <w:pPr>
-              <w:jc w:val="center"/>
-              <w:rPr>
-                <w:sz w:val="36"/>
-                <w:szCs w:val="36"/>
-                <w:u w:val="single"/>
-                <w:lang w:val="fr-FR"/>
-              </w:rPr>
-            </w:pPr>
-          </w:p>
-        </w:tc>
-        <w:tc>
-          <w:tcPr>
-            <w:tcW w:w="2338" w:type="dxa"/>
-          </w:tcPr>
-          <w:p>
-            <w:pPr>
-              <w:jc w:val="center"/>
-              <w:rPr>
-                <w:sz w:val="36"/>
-                <w:szCs w:val="36"/>
-                <w:u w:val="single"/>
-                <w:lang w:val="fr-FR"/>
-              </w:rPr>
-            </w:pPr>
-          </w:p>
-        </w:tc>
-      </w:tr>
-      <w:tr>
-        <w:tc>
-          <w:tcPr>
-            <w:tcW w:w="2337" w:type="dxa"/>
-          </w:tcPr>
-          <w:p>
-            <w:pPr>
-              <w:jc w:val="center"/>
-              <w:rPr>
-                <w:sz w:val="36"/>
-                <w:szCs w:val="36"/>
-                <w:u w:val="single"/>
-                <w:lang w:val="fr-FR"/>
-              </w:rPr>
-            </w:pPr>
-          </w:p>
-        </w:tc>
-        <w:tc>
-          <w:tcPr>
-            <w:tcW w:w="2337" w:type="dxa"/>
-          </w:tcPr>
-          <w:p>
-            <w:pPr>
-              <w:jc w:val="center"/>
-              <w:rPr>
-                <w:sz w:val="36"/>
-                <w:szCs w:val="36"/>
-                <w:u w:val="single"/>
-                <w:lang w:val="fr-FR"/>
-              </w:rPr>
-            </w:pPr>
-          </w:p>
-        </w:tc>
-        <w:tc>
-          <w:tcPr>
-            <w:tcW w:w="2338" w:type="dxa"/>
-          </w:tcPr>
-          <w:p>
-            <w:pPr>
-              <w:jc w:val="center"/>
-              <w:rPr>
-                <w:sz w:val="36"/>
-                <w:szCs w:val="36"/>
-                <w:u w:val="single"/>
-                <w:lang w:val="fr-FR"/>
-              </w:rPr>
-            </w:pPr>
-          </w:p>
-        </w:tc>
-        <w:tc>
-          <w:tcPr>
-            <w:tcW w:w="2338" w:type="dxa"/>
-          </w:tcPr>
-          <w:p>
-            <w:pPr>
-              <w:jc w:val="center"/>
-              <w:rPr>
-                <w:sz w:val="36"/>
-                <w:szCs w:val="36"/>
-                <w:u w:val="single"/>
-                <w:lang w:val="fr-FR"/>
-              </w:rPr>
-            </w:pPr>
-          </w:p>
-        </w:tc>
-      </w:tr>
-      <w:tr>
-        <w:tc>
-          <w:tcPr>
-            <w:tcW w:w="2337" w:type="dxa"/>
-          </w:tcPr>
-          <w:p>
-            <w:pPr>
-              <w:jc w:val="center"/>
-              <w:rPr>
-                <w:sz w:val="36"/>
-                <w:szCs w:val="36"/>
-                <w:u w:val="single"/>
-                <w:lang w:val="fr-FR"/>
-              </w:rPr>
-            </w:pPr>
-          </w:p>
-        </w:tc>
-        <w:tc>
-          <w:tcPr>
-            <w:tcW w:w="2337" w:type="dxa"/>
-          </w:tcPr>
-          <w:p>
-            <w:pPr>
-              <w:jc w:val="center"/>
-              <w:rPr>
-                <w:sz w:val="36"/>
-                <w:szCs w:val="36"/>
-                <w:u w:val="single"/>
-                <w:lang w:val="fr-FR"/>
-              </w:rPr>
-            </w:pPr>
-          </w:p>
-        </w:tc>
-        <w:tc>
-          <w:tcPr>
-            <w:tcW w:w="2338" w:type="dxa"/>
-          </w:tcPr>
-          <w:p>
-            <w:pPr>
-              <w:jc w:val="center"/>
-              <w:rPr>
-                <w:sz w:val="36"/>
-                <w:szCs w:val="36"/>
-                <w:u w:val="single"/>
-                <w:lang w:val="fr-FR"/>
-              </w:rPr>
-            </w:pPr>
-          </w:p>
-        </w:tc>
-        <w:tc>
-          <w:tcPr>
-            <w:tcW w:w="2338" w:type="dxa"/>
-          </w:tcPr>
-          <w:p>
-            <w:pPr>
-              <w:jc w:val="center"/>
-              <w:rPr>
-                <w:sz w:val="36"/>
-                <w:szCs w:val="36"/>
-                <w:u w:val="single"/>
-                <w:lang w:val="fr-FR"/>
-              </w:rPr>
-            </w:pPr>
-          </w:p>
-        </w:tc>
-      </w:tr>
-      <w:tr>
-        <w:tc>
-          <w:tcPr>
-            <w:tcW w:w="2337" w:type="dxa"/>
-          </w:tcPr>
-          <w:p>
-            <w:pPr>
-              <w:jc w:val="center"/>
-              <w:rPr>
-                <w:sz w:val="36"/>
-                <w:szCs w:val="36"/>
-                <w:u w:val="single"/>
-                <w:lang w:val="fr-FR"/>
-              </w:rPr>
-            </w:pPr>
-          </w:p>
-        </w:tc>
-        <w:tc>
-          <w:tcPr>
-            <w:tcW w:w="2337" w:type="dxa"/>
-          </w:tcPr>
-          <w:p>
-            <w:pPr>
-              <w:jc w:val="center"/>
-              <w:rPr>
-                <w:sz w:val="36"/>
-                <w:szCs w:val="36"/>
-                <w:u w:val="single"/>
-                <w:lang w:val="fr-FR"/>
-              </w:rPr>
-            </w:pPr>
-          </w:p>
-        </w:tc>
-        <w:tc>
-          <w:tcPr>
-            <w:tcW w:w="2338" w:type="dxa"/>
-          </w:tcPr>
-          <w:p>
-            <w:pPr>
-              <w:jc w:val="center"/>
-              <w:rPr>
-                <w:sz w:val="36"/>
-                <w:szCs w:val="36"/>
-                <w:u w:val="single"/>
-                <w:lang w:val="fr-FR"/>
-              </w:rPr>
-            </w:pPr>
-          </w:p>
-        </w:tc>
-        <w:tc>
-          <w:tcPr>
-            <w:tcW w:w="2338" w:type="dxa"/>
-          </w:tcPr>
-          <w:p>
-            <w:pPr>
-              <w:jc w:val="center"/>
-              <w:rPr>
-                <w:sz w:val="36"/>
-                <w:szCs w:val="36"/>
-                <w:u w:val="single"/>
-                <w:lang w:val="fr-FR"/>
-              </w:rPr>
-            </w:pPr>
-          </w:p>
-        </w:tc>
-      </w:tr>
-    </w:tbl>
     <w:p>
       <w:pPr>
         <w:rPr>
@@ -828,101 +168,163 @@
         <w:t>TABLE DES MATIERES</w:t>
       </w:r>
     </w:p>
-    <w:p>
-      <w:pPr>
-        <w:tabs>
-          <w:tab w:val="left" w:pos="3000"/>
-        </w:tabs>
-        <w:jc w:val="center"/>
-        <w:rPr>
-          <w:b/>
-          <w:color w:val="000000" w:themeColor="text1"/>
-          <w:sz w:val="32"/>
-          <w:szCs w:val="32"/>
-          <w:lang w:val="fr-FR"/>
-        </w:rPr>
-      </w:pPr>
-    </w:p>
-    <w:p>
-      <w:pPr>
-        <w:pStyle w:val="Paragraphedeliste"/>
-        <w:numPr>
-          <w:ilvl w:val="0"/>
-          <w:numId w:val="5"/>
-        </w:numPr>
-        <w:tabs>
-          <w:tab w:val="left" w:pos="3000"/>
-        </w:tabs>
-        <w:rPr>
-          <w:b/>
-          <w:color w:val="000000" w:themeColor="text1"/>
-          <w:sz w:val="32"/>
-          <w:szCs w:val="32"/>
-          <w:lang w:val="fr-FR"/>
-        </w:rPr>
-      </w:pPr>
-      <w:r>
-        <w:rPr>
-          <w:color w:val="000000" w:themeColor="text1"/>
-          <w:sz w:val="32"/>
-          <w:szCs w:val="32"/>
-          <w:lang w:val="fr-FR"/>
-        </w:rPr>
-        <w:t>Analyse univarié</w:t>
-      </w:r>
-    </w:p>
-    <w:p>
-      <w:pPr>
-        <w:pStyle w:val="Paragraphedeliste"/>
-        <w:numPr>
-          <w:ilvl w:val="0"/>
-          <w:numId w:val="5"/>
-        </w:numPr>
-        <w:tabs>
-          <w:tab w:val="left" w:pos="3000"/>
-        </w:tabs>
-        <w:rPr>
-          <w:b/>
-          <w:color w:val="000000" w:themeColor="text1"/>
-          <w:sz w:val="32"/>
-          <w:szCs w:val="32"/>
-          <w:lang w:val="fr-FR"/>
-        </w:rPr>
-      </w:pPr>
-      <w:r>
-        <w:rPr>
-          <w:color w:val="000000" w:themeColor="text1"/>
-          <w:sz w:val="32"/>
-          <w:szCs w:val="32"/>
-          <w:lang w:val="fr-FR"/>
-        </w:rPr>
-        <w:t>Analyse bivariée</w:t>
-      </w:r>
-    </w:p>
-    <w:p>
-      <w:pPr>
-        <w:pStyle w:val="Paragraphedeliste"/>
-        <w:numPr>
-          <w:ilvl w:val="0"/>
-          <w:numId w:val="5"/>
-        </w:numPr>
-        <w:tabs>
-          <w:tab w:val="left" w:pos="3000"/>
-        </w:tabs>
-        <w:rPr>
-          <w:color w:val="000000" w:themeColor="text1"/>
-          <w:sz w:val="32"/>
-          <w:szCs w:val="32"/>
-          <w:lang w:val="fr-FR"/>
-        </w:rPr>
-      </w:pPr>
-    </w:p>
-    <w:p>
-      <w:pPr>
-        <w:rPr>
-          <w:color w:val="000000" w:themeColor="text1"/>
-          <w:sz w:val="32"/>
-          <w:szCs w:val="32"/>
+    <w:sdt>
+      <w:sdtPr>
+        <w:rPr>
+          <w:lang w:val="fr-FR"/>
+        </w:rPr>
+        <w:id w:val="525526788"/>
+        <w:docPartObj>
+          <w:docPartGallery w:val="Table of Contents"/>
+          <w:docPartUnique/>
+        </w:docPartObj>
+      </w:sdtPr>
+      <w:sdtEndPr>
+        <w:rPr>
+          <w:rFonts w:asciiTheme="minorHAnsi" w:eastAsiaTheme="minorEastAsia" w:hAnsiTheme="minorHAnsi" w:cs="Times New Roman"/>
+          <w:color w:val="auto"/>
+          <w:sz w:val="22"/>
+          <w:szCs w:val="22"/>
+        </w:rPr>
+      </w:sdtEndPr>
+      <w:sdtContent>
+        <w:p>
+          <w:pPr>
+            <w:pStyle w:val="En-ttedetabledesmatires"/>
+            <w:rPr>
+              <w:lang w:val="fr-FR"/>
+            </w:rPr>
+          </w:pPr>
+        </w:p>
+        <w:p>
+          <w:pPr>
+            <w:pStyle w:val="TM1"/>
+            <w:numPr>
+              <w:ilvl w:val="0"/>
+              <w:numId w:val="9"/>
+            </w:numPr>
+            <w:rPr>
+              <w:lang w:val="fr-FR"/>
+            </w:rPr>
+          </w:pPr>
+          <w:r>
+            <w:rPr>
+              <w:sz w:val="28"/>
+              <w:szCs w:val="28"/>
+              <w:lang w:val="fr-FR"/>
+            </w:rPr>
+            <w:t>Analyse univarié</w:t>
+          </w:r>
+          <w:r>
+            <w:rPr>
+              <w:lang w:val="fr-FR"/>
+            </w:rPr>
+            <w:t xml:space="preserve"> </w:t>
+          </w:r>
+          <w:r>
+            <w:ptab w:relativeTo="margin" w:alignment="right" w:leader="dot"/>
+          </w:r>
+          <w:r>
+            <w:rPr>
+              <w:b/>
+              <w:bCs/>
+              <w:lang w:val="fr-FR"/>
+            </w:rPr>
+            <w:t>3</w:t>
+          </w:r>
+        </w:p>
+        <w:p>
+          <w:pPr>
+            <w:pStyle w:val="TM2"/>
+            <w:numPr>
+              <w:ilvl w:val="0"/>
+              <w:numId w:val="9"/>
+            </w:numPr>
+            <w:rPr>
+              <w:lang w:val="fr-FR"/>
+            </w:rPr>
+          </w:pPr>
+          <w:r>
+            <w:rPr>
+              <w:color w:val="000000" w:themeColor="text1"/>
+              <w:sz w:val="28"/>
+              <w:szCs w:val="28"/>
+              <w:lang w:val="fr-FR"/>
+            </w:rPr>
+            <w:t>Analyse bivariée</w:t>
+          </w:r>
+          <w:r>
+            <w:rPr>
+              <w:color w:val="000000" w:themeColor="text1"/>
+              <w:sz w:val="32"/>
+              <w:szCs w:val="32"/>
+              <w:lang w:val="fr-FR"/>
+            </w:rPr>
+            <w:t xml:space="preserve"> </w:t>
+          </w:r>
+          <w:r>
+            <w:ptab w:relativeTo="margin" w:alignment="right" w:leader="dot"/>
+          </w:r>
+          <w:r>
+            <w:rPr>
+              <w:lang w:val="fr-FR"/>
+            </w:rPr>
+            <w:t>4</w:t>
+          </w:r>
+        </w:p>
+        <w:p>
+          <w:pPr>
+            <w:pStyle w:val="TM3"/>
+            <w:numPr>
+              <w:ilvl w:val="0"/>
+              <w:numId w:val="9"/>
+            </w:numPr>
+            <w:rPr>
+              <w:lang w:val="fr-FR"/>
+            </w:rPr>
+          </w:pPr>
+          <w:r>
+            <w:rPr>
+              <w:color w:val="000000" w:themeColor="text1"/>
+              <w:sz w:val="28"/>
+              <w:szCs w:val="28"/>
+              <w:lang w:val="fr-FR"/>
+            </w:rPr>
+            <w:t>Analyse multivariée</w:t>
+          </w:r>
+          <w:r>
+            <w:rPr>
+              <w:color w:val="000000" w:themeColor="text1"/>
+              <w:sz w:val="32"/>
+              <w:szCs w:val="32"/>
+              <w:lang w:val="fr-FR"/>
+            </w:rPr>
+            <w:t xml:space="preserve"> </w:t>
+          </w:r>
+          <w:r>
+            <w:ptab w:relativeTo="margin" w:alignment="right" w:leader="dot"/>
+          </w:r>
+          <w:r>
+            <w:rPr>
+              <w:lang w:val="fr-FR"/>
+            </w:rPr>
+            <w:t>5</w:t>
+          </w:r>
+        </w:p>
+        <w:p>
+          <w:pPr>
+            <w:pStyle w:val="TM3"/>
+            <w:rPr>
+              <w:lang w:val="fr-FR"/>
+            </w:rPr>
+          </w:pPr>
+        </w:p>
+      </w:sdtContent>
+    </w:sdt>
+    <w:p>
+      <w:pPr>
+        <w:pStyle w:val="TM3"/>
+        <w:rPr>
           <w:lang w:val="fr-FR"/>
         </w:rPr>
       </w:pPr>
@@ -2124,8 +1526,6 @@
         </w:rPr>
         <w:t>Nous constatons donc qu’il a aussi une forte corrélation entre la pression diastolique et systolique ce qui nous amène à créer une feature de ratio pour capturer leur relation.</w:t>
       </w:r>
-      <w:bookmarkStart w:id="0" w:name="_GoBack"/>
-      <w:bookmarkEnd w:id="0"/>
     </w:p>
     <w:p>
       <w:pPr>
@@ -2329,6 +1729,92 @@
     </w:lvl>
   </w:abstractNum>
   <w:abstractNum w:abstractNumId="1" w15:restartNumberingAfterBreak="0">
+    <w:nsid w:val="07CA71BF"/>
+    <w:multiLevelType w:val="hybridMultilevel"/>
+    <w:tmpl w:val="7E46A37A"/>
+    <w:lvl w:ilvl="0" w:tplc="04090013">
+      <w:start w:val="1"/>
+      <w:numFmt w:val="upperRoman"/>
+      <w:lvlText w:val="%1."/>
+      <w:lvlJc w:val="right"/>
+      <w:pPr>
+        <w:ind w:left="720" w:hanging="360"/>
+      </w:pPr>
+    </w:lvl>
+    <w:lvl w:ilvl="1" w:tplc="04090019" w:tentative="1">
+      <w:start w:val="1"/>
+      <w:numFmt w:val="lowerLetter"/>
+      <w:lvlText w:val="%2."/>
+      <w:lvlJc w:val="left"/>
+      <w:pPr>
+        <w:ind w:left="1440" w:hanging="360"/>
+      </w:pPr>
+    </w:lvl>
+    <w:lvl w:ilvl="2" w:tplc="0409001B" w:tentative="1">
+      <w:start w:val="1"/>
+      <w:numFmt w:val="lowerRoman"/>
+      <w:lvlText w:val="%3."/>
+      <w:lvlJc w:val="right"/>
+      <w:pPr>
+        <w:ind w:left="2160" w:hanging="180"/>
+      </w:pPr>
+    </w:lvl>
+    <w:lvl w:ilvl="3" w:tplc="0409000F" w:tentative="1">
+      <w:start w:val="1"/>
+      <w:numFmt w:val="decimal"/>
+      <w:lvlText w:val="%4."/>
+      <w:lvlJc w:val="left"/>
+      <w:pPr>
+        <w:ind w:left="2880" w:hanging="360"/>
+      </w:pPr>
+    </w:lvl>
+    <w:lvl w:ilvl="4" w:tplc="04090019" w:tentative="1">
+      <w:start w:val="1"/>
+      <w:numFmt w:val="lowerLetter"/>
+      <w:lvlText w:val="%5."/>
+      <w:lvlJc w:val="left"/>
+      <w:pPr>
+        <w:ind w:left="3600" w:hanging="360"/>
+      </w:pPr>
+    </w:lvl>
+    <w:lvl w:ilvl="5" w:tplc="0409001B" w:tentative="1">
+      <w:start w:val="1"/>
+      <w:numFmt w:val="lowerRoman"/>
+      <w:lvlText w:val="%6."/>
+      <w:lvlJc w:val="right"/>
+      <w:pPr>
+        <w:ind w:left="4320" w:hanging="180"/>
+      </w:pPr>
+    </w:lvl>
+    <w:lvl w:ilvl="6" w:tplc="0409000F" w:tentative="1">
+      <w:start w:val="1"/>
+      <w:numFmt w:val="decimal"/>
+      <w:lvlText w:val="%7."/>
+      <w:lvlJc w:val="left"/>
+      <w:pPr>
+        <w:ind w:left="5040" w:hanging="360"/>
+      </w:pPr>
+    </w:lvl>
+    <w:lvl w:ilvl="7" w:tplc="04090019" w:tentative="1">
+      <w:start w:val="1"/>
+      <w:numFmt w:val="lowerLetter"/>
+      <w:lvlText w:val="%8."/>
+      <w:lvlJc w:val="left"/>
+      <w:pPr>
+        <w:ind w:left="5760" w:hanging="360"/>
+      </w:pPr>
+    </w:lvl>
+    <w:lvl w:ilvl="8" w:tplc="0409001B" w:tentative="1">
+      <w:start w:val="1"/>
+      <w:numFmt w:val="lowerRoman"/>
+      <w:lvlText w:val="%9."/>
+      <w:lvlJc w:val="right"/>
+      <w:pPr>
+        <w:ind w:left="6480" w:hanging="180"/>
+      </w:pPr>
+    </w:lvl>
+  </w:abstractNum>
+  <w:abstractNum w:abstractNumId="2" w15:restartNumberingAfterBreak="0">
     <w:nsid w:val="1AEE4077"/>
     <w:multiLevelType w:val="hybridMultilevel"/>
     <w:tmpl w:val="D0502D70"/>
@@ -2417,7 +1903,7 @@
       </w:pPr>
     </w:lvl>
   </w:abstractNum>
-  <w:abstractNum w:abstractNumId="2" w15:restartNumberingAfterBreak="0">
+  <w:abstractNum w:abstractNumId="3" w15:restartNumberingAfterBreak="0">
     <w:nsid w:val="5CE86F4D"/>
     <w:multiLevelType w:val="hybridMultilevel"/>
     <w:tmpl w:val="76B4767E"/>
@@ -2503,7 +1989,7 @@
       </w:pPr>
     </w:lvl>
   </w:abstractNum>
-  <w:abstractNum w:abstractNumId="3" w15:restartNumberingAfterBreak="0">
+  <w:abstractNum w:abstractNumId="4" w15:restartNumberingAfterBreak="0">
     <w:nsid w:val="60031D36"/>
     <w:multiLevelType w:val="hybridMultilevel"/>
     <w:tmpl w:val="6436C37A"/>
@@ -2589,7 +2075,7 @@
       </w:pPr>
     </w:lvl>
   </w:abstractNum>
-  <w:abstractNum w:abstractNumId="4" w15:restartNumberingAfterBreak="0">
+  <w:abstractNum w:abstractNumId="5" w15:restartNumberingAfterBreak="0">
     <w:nsid w:val="62203A6C"/>
     <w:multiLevelType w:val="hybridMultilevel"/>
     <w:tmpl w:val="F0D4AE2E"/>
@@ -2675,7 +2161,96 @@
       </w:pPr>
     </w:lvl>
   </w:abstractNum>
-  <w:abstractNum w:abstractNumId="5" w15:restartNumberingAfterBreak="0">
+  <w:abstractNum w:abstractNumId="6" w15:restartNumberingAfterBreak="0">
+    <w:nsid w:val="68F301EB"/>
+    <w:multiLevelType w:val="hybridMultilevel"/>
+    <w:tmpl w:val="F426F8C4"/>
+    <w:lvl w:ilvl="0" w:tplc="27F410EE">
+      <w:start w:val="1"/>
+      <w:numFmt w:val="upperRoman"/>
+      <w:lvlText w:val="%1."/>
+      <w:lvlJc w:val="left"/>
+      <w:pPr>
+        <w:ind w:left="1080" w:hanging="720"/>
+      </w:pPr>
+      <w:rPr>
+        <w:rFonts w:hint="default"/>
+      </w:rPr>
+    </w:lvl>
+    <w:lvl w:ilvl="1" w:tplc="04090019" w:tentative="1">
+      <w:start w:val="1"/>
+      <w:numFmt w:val="lowerLetter"/>
+      <w:lvlText w:val="%2."/>
+      <w:lvlJc w:val="left"/>
+      <w:pPr>
+        <w:ind w:left="1440" w:hanging="360"/>
+      </w:pPr>
+    </w:lvl>
+    <w:lvl w:ilvl="2" w:tplc="0409001B" w:tentative="1">
+      <w:start w:val="1"/>
+      <w:numFmt w:val="lowerRoman"/>
+      <w:lvlText w:val="%3."/>
+      <w:lvlJc w:val="right"/>
+      <w:pPr>
+        <w:ind w:left="2160" w:hanging="180"/>
+      </w:pPr>
+    </w:lvl>
+    <w:lvl w:ilvl="3" w:tplc="0409000F" w:tentative="1">
+      <w:start w:val="1"/>
+      <w:numFmt w:val="decimal"/>
+      <w:lvlText w:val="%4."/>
+      <w:lvlJc w:val="left"/>
+      <w:pPr>
+        <w:ind w:left="2880" w:hanging="360"/>
+      </w:pPr>
+    </w:lvl>
+    <w:lvl w:ilvl="4" w:tplc="04090019" w:tentative="1">
+      <w:start w:val="1"/>
+      <w:numFmt w:val="lowerLetter"/>
+      <w:lvlText w:val="%5."/>
+      <w:lvlJc w:val="left"/>
+      <w:pPr>
+        <w:ind w:left="3600" w:hanging="360"/>
+      </w:pPr>
+    </w:lvl>
+    <w:lvl w:ilvl="5" w:tplc="0409001B" w:tentative="1">
+      <w:start w:val="1"/>
+      <w:numFmt w:val="lowerRoman"/>
+      <w:lvlText w:val="%6."/>
+      <w:lvlJc w:val="right"/>
+      <w:pPr>
+        <w:ind w:left="4320" w:hanging="180"/>
+      </w:pPr>
+    </w:lvl>
+    <w:lvl w:ilvl="6" w:tplc="0409000F" w:tentative="1">
+      <w:start w:val="1"/>
+      <w:numFmt w:val="decimal"/>
+      <w:lvlText w:val="%7."/>
+      <w:lvlJc w:val="left"/>
+      <w:pPr>
+        <w:ind w:left="5040" w:hanging="360"/>
+      </w:pPr>
+    </w:lvl>
+    <w:lvl w:ilvl="7" w:tplc="04090019" w:tentative="1">
+      <w:start w:val="1"/>
+      <w:numFmt w:val="lowerLetter"/>
+      <w:lvlText w:val="%8."/>
+      <w:lvlJc w:val="left"/>
+      <w:pPr>
+        <w:ind w:left="5760" w:hanging="360"/>
+      </w:pPr>
+    </w:lvl>
+    <w:lvl w:ilvl="8" w:tplc="0409001B" w:tentative="1">
+      <w:start w:val="1"/>
+      <w:numFmt w:val="lowerRoman"/>
+      <w:lvlText w:val="%9."/>
+      <w:lvlJc w:val="right"/>
+      <w:pPr>
+        <w:ind w:left="6480" w:hanging="180"/>
+      </w:pPr>
+    </w:lvl>
+  </w:abstractNum>
+  <w:abstractNum w:abstractNumId="7" w15:restartNumberingAfterBreak="0">
     <w:nsid w:val="72BF600B"/>
     <w:multiLevelType w:val="hybridMultilevel"/>
     <w:tmpl w:val="7E46A37A"/>
@@ -2761,7 +2336,7 @@
       </w:pPr>
     </w:lvl>
   </w:abstractNum>
-  <w:abstractNum w:abstractNumId="6" w15:restartNumberingAfterBreak="0">
+  <w:abstractNum w:abstractNumId="8" w15:restartNumberingAfterBreak="0">
     <w:nsid w:val="7CDE20D9"/>
     <w:multiLevelType w:val="hybridMultilevel"/>
     <w:tmpl w:val="BD1EB1AC"/>
@@ -2875,25 +2450,31 @@
     </w:lvl>
   </w:abstractNum>
   <w:num w:numId="1">
+    <w:abstractNumId w:val="5"/>
+  </w:num>
+  <w:num w:numId="2">
+    <w:abstractNumId w:val="3"/>
+  </w:num>
+  <w:num w:numId="3">
     <w:abstractNumId w:val="4"/>
   </w:num>
-  <w:num w:numId="2">
-    <w:abstractNumId w:val="2"/>
-  </w:num>
-  <w:num w:numId="3">
-    <w:abstractNumId w:val="3"/>
-  </w:num>
   <w:num w:numId="4">
-    <w:abstractNumId w:val="6"/>
+    <w:abstractNumId w:val="8"/>
   </w:num>
   <w:num w:numId="5">
-    <w:abstractNumId w:val="5"/>
+    <w:abstractNumId w:val="7"/>
   </w:num>
   <w:num w:numId="6">
-    <w:abstractNumId w:val="1"/>
+    <w:abstractNumId w:val="2"/>
   </w:num>
   <w:num w:numId="7">
     <w:abstractNumId w:val="0"/>
+  </w:num>
+  <w:num w:numId="8">
+    <w:abstractNumId w:val="1"/>
+  </w:num>
+  <w:num w:numId="9">
+    <w:abstractNumId w:val="6"/>
   </w:num>
 </w:numbering>
 </file>
@@ -2904,6 +2485,687 @@
     <w:rPrDefault>
       <w:rPr>
         <w:rFonts w:asciiTheme="minorHAnsi" w:eastAsiaTheme="minorHAnsi" w:hAnsiTheme="minorHAnsi" w:cstheme="minorBidi"/>
+        <w:sz w:val="22"/>
+        <w:szCs w:val="22"/>
+        <w:lang w:val="en-US" w:eastAsia="en-US" w:bidi="ar-SA"/>
+      </w:rPr>
+    </w:rPrDefault>
+    <w:pPrDefault>
+      <w:pPr>
+        <w:spacing w:after="160" w:line="259" w:lineRule="auto"/>
+      </w:pPr>
+    </w:pPrDefault>
+  </w:docDefaults>
+  <w:latentStyles w:defLockedState="0" w:defUIPriority="99" w:defSemiHidden="0" w:defUnhideWhenUsed="0" w:defQFormat="0" w:count="371">
+    <w:lsdException w:name="Normal" w:uiPriority="0" w:qFormat="1"/>
+    <w:lsdException w:name="heading 1" w:uiPriority="9" w:qFormat="1"/>
+    <w:lsdException w:name="heading 2" w:semiHidden="1" w:uiPriority="9" w:unhideWhenUsed="1" w:qFormat="1"/>
+    <w:lsdException w:name="heading 3" w:semiHidden="1" w:uiPriority="9" w:unhideWhenUsed="1" w:qFormat="1"/>
+    <w:lsdException w:name="heading 4" w:semiHidden="1" w:uiPriority="9" w:unhideWhenUsed="1" w:qFormat="1"/>
+    <w:lsdException w:name="heading 5" w:semiHidden="1" w:uiPriority="9" w:unhideWhenUsed="1" w:qFormat="1"/>
+    <w:lsdException w:name="heading 6" w:semiHidden="1" w:uiPriority="9" w:unhideWhenUsed="1" w:qFormat="1"/>
+    <w:lsdException w:name="heading 7" w:semiHidden="1" w:uiPriority="9" w:unhideWhenUsed="1" w:qFormat="1"/>
+    <w:lsdException w:name="heading 8" w:semiHidden="1" w:uiPriority="9" w:unhideWhenUsed="1" w:qFormat="1"/>
+    <w:lsdException w:name="heading 9" w:semiHidden="1" w:uiPriority="9" w:unhideWhenUsed="1" w:qFormat="1"/>
+    <w:lsdException w:name="index 1" w:semiHidden="1" w:unhideWhenUsed="1"/>
+    <w:lsdException w:name="index 2" w:semiHidden="1" w:unhideWhenUsed="1"/>
+    <w:lsdException w:name="index 3" w:semiHidden="1" w:unhideWhenUsed="1"/>
+    <w:lsdException w:name="index 4" w:semiHidden="1" w:unhideWhenUsed="1"/>
+    <w:lsdException w:name="index 5" w:semiHidden="1" w:unhideWhenUsed="1"/>
+    <w:lsdException w:name="index 6" w:semiHidden="1" w:unhideWhenUsed="1"/>
+    <w:lsdException w:name="index 7" w:semiHidden="1" w:unhideWhenUsed="1"/>
+    <w:lsdException w:name="index 8" w:semiHidden="1" w:unhideWhenUsed="1"/>
+    <w:lsdException w:name="index 9" w:semiHidden="1" w:unhideWhenUsed="1"/>
+    <w:lsdException w:name="toc 1" w:semiHidden="1" w:uiPriority="39" w:unhideWhenUsed="1"/>
+    <w:lsdException w:name="toc 2" w:semiHidden="1" w:uiPriority="39" w:unhideWhenUsed="1"/>
+    <w:lsdException w:name="toc 3" w:semiHidden="1" w:uiPriority="39" w:unhideWhenUsed="1"/>
+    <w:lsdException w:name="toc 4" w:semiHidden="1" w:uiPriority="39" w:unhideWhenUsed="1"/>
+    <w:lsdException w:name="toc 5" w:semiHidden="1" w:uiPriority="39" w:unhideWhenUsed="1"/>
+    <w:lsdException w:name="toc 6" w:semiHidden="1" w:uiPriority="39" w:unhideWhenUsed="1"/>
+    <w:lsdException w:name="toc 7" w:semiHidden="1" w:uiPriority="39" w:unhideWhenUsed="1"/>
+    <w:lsdException w:name="toc 8" w:semiHidden="1" w:uiPriority="39" w:unhideWhenUsed="1"/>
+    <w:lsdException w:name="toc 9" w:semiHidden="1" w:uiPriority="39" w:unhideWhenUsed="1"/>
+    <w:lsdException w:name="Normal Indent" w:semiHidden="1" w:unhideWhenUsed="1"/>
+    <w:lsdException w:name="footnote text" w:semiHidden="1" w:unhideWhenUsed="1"/>
+    <w:lsdException w:name="annotation text" w:semiHidden="1" w:unhideWhenUsed="1"/>
+    <w:lsdException w:name="header" w:semiHidden="1" w:unhideWhenUsed="1"/>
+    <w:lsdException w:name="footer" w:semiHidden="1" w:unhideWhenUsed="1"/>
+    <w:lsdException w:name="index heading" w:semiHidden="1" w:unhideWhenUsed="1"/>
+    <w:lsdException w:name="caption" w:semiHidden="1" w:uiPriority="35" w:unhideWhenUsed="1" w:qFormat="1"/>
+    <w:lsdException w:name="table of figures" w:semiHidden="1" w:unhideWhenUsed="1"/>
+    <w:lsdException w:name="envelope address" w:semiHidden="1" w:unhideWhenUsed="1"/>
+    <w:lsdException w:name="envelope return" w:semiHidden="1" w:unhideWhenUsed="1"/>
+    <w:lsdException w:name="footnote reference" w:semiHidden="1" w:unhideWhenUsed="1"/>
+    <w:lsdException w:name="annotation reference" w:semiHidden="1" w:unhideWhenUsed="1"/>
+    <w:lsdException w:name="line number" w:semiHidden="1" w:unhideWhenUsed="1"/>
+    <w:lsdException w:name="page number" w:semiHidden="1" w:unhideWhenUsed="1"/>
+    <w:lsdException w:name="endnote reference" w:semiHidden="1" w:unhideWhenUsed="1"/>
+    <w:lsdException w:name="endnote text" w:semiHidden="1" w:unhideWhenUsed="1"/>
+    <w:lsdException w:name="table of authorities" w:semiHidden="1" w:unhideWhenUsed="1"/>
+    <w:lsdException w:name="macro" w:semiHidden="1" w:unhideWhenUsed="1"/>
+    <w:lsdException w:name="toa heading" w:semiHidden="1" w:unhideWhenUsed="1"/>
+    <w:lsdException w:name="List" w:semiHidden="1" w:unhideWhenUsed="1"/>
+    <w:lsdException w:name="List Bullet" w:semiHidden="1" w:unhideWhenUsed="1"/>
+    <w:lsdException w:name="List Number" w:semiHidden="1" w:unhideWhenUsed="1"/>
+    <w:lsdException w:name="List 2" w:semiHidden="1" w:unhideWhenUsed="1"/>
+    <w:lsdException w:name="List 3" w:semiHidden="1" w:unhideWhenUsed="1"/>
+    <w:lsdException w:name="List 4" w:semiHidden="1" w:unhideWhenUsed="1"/>
+    <w:lsdException w:name="List 5" w:semiHidden="1" w:unhideWhenUsed="1"/>
+    <w:lsdException w:name="List Bullet 2" w:semiHidden="1" w:unhideWhenUsed="1"/>
+    <w:lsdException w:name="List Bullet 3" w:semiHidden="1" w:unhideWhenUsed="1"/>
+    <w:lsdException w:name="List Bullet 4" w:semiHidden="1" w:unhideWhenUsed="1"/>
+    <w:lsdException w:name="List Bullet 5" w:semiHidden="1" w:unhideWhenUsed="1"/>
+    <w:lsdException w:name="List Number 2" w:semiHidden="1" w:unhideWhenUsed="1"/>
+    <w:lsdException w:name="List Number 3" w:semiHidden="1" w:unhideWhenUsed="1"/>
+    <w:lsdException w:name="List Number 4" w:semiHidden="1" w:unhideWhenUsed="1"/>
+    <w:lsdException w:name="List Number 5" w:semiHidden="1" w:unhideWhenUsed="1"/>
+    <w:lsdException w:name="Title" w:uiPriority="10" w:qFormat="1"/>
+    <w:lsdException w:name="Closing" w:semiHidden="1" w:unhideWhenUsed="1"/>
+    <w:lsdException w:name="Signature" w:semiHidden="1" w:unhideWhenUsed="1"/>
+    <w:lsdException w:name="Default Paragraph Font" w:semiHidden="1" w:uiPriority="1" w:unhideWhenUsed="1"/>
+    <w:lsdException w:name="Body Text" w:semiHidden="1" w:unhideWhenUsed="1"/>
+    <w:lsdException w:name="Body Text Indent" w:semiHidden="1" w:unhideWhenUsed="1"/>
+    <w:lsdException w:name="List Continue" w:semiHidden="1" w:unhideWhenUsed="1"/>
+    <w:lsdException w:name="List Continue 2" w:semiHidden="1" w:unhideWhenUsed="1"/>
+    <w:lsdException w:name="List Continue 3" w:semiHidden="1" w:unhideWhenUsed="1"/>
+    <w:lsdException w:name="List Continue 4" w:semiHidden="1" w:unhideWhenUsed="1"/>
+    <w:lsdException w:name="List Continue 5" w:semiHidden="1" w:unhideWhenUsed="1"/>
+    <w:lsdException w:name="Message Header" w:semiHidden="1" w:unhideWhenUsed="1"/>
+    <w:lsdException w:name="Subtitle" w:uiPriority="11" w:qFormat="1"/>
+    <w:lsdException w:name="Salutation" w:semiHidden="1" w:unhideWhenUsed="1"/>
+    <w:lsdException w:name="Date" w:semiHidden="1" w:unhideWhenUsed="1"/>
+    <w:lsdException w:name="Body Text First Indent" w:semiHidden="1" w:unhideWhenUsed="1"/>
+    <w:lsdException w:name="Body Text First Indent 2" w:semiHidden="1" w:unhideWhenUsed="1"/>
+    <w:lsdException w:name="Note Heading" w:semiHidden="1" w:unhideWhenUsed="1"/>
+    <w:lsdException w:name="Body Text 2" w:semiHidden="1" w:unhideWhenUsed="1"/>
+    <w:lsdException w:name="Body Text 3" w:semiHidden="1" w:unhideWhenUsed="1"/>
+    <w:lsdException w:name="Body Text Indent 2" w:semiHidden="1" w:unhideWhenUsed="1"/>
+    <w:lsdException w:name="Body Text Indent 3" w:semiHidden="1" w:unhideWhenUsed="1"/>
+    <w:lsdException w:name="Block Text" w:semiHidden="1" w:unhideWhenUsed="1"/>
+    <w:lsdException w:name="Hyperlink" w:semiHidden="1" w:unhideWhenUsed="1"/>
+    <w:lsdException w:name="FollowedHyperlink" w:semiHidden="1" w:unhideWhenUsed="1"/>
+    <w:lsdException w:name="Strong" w:uiPriority="22" w:qFormat="1"/>
+    <w:lsdException w:name="Emphasis" w:uiPriority="20" w:qFormat="1"/>
+    <w:lsdException w:name="Document Map" w:semiHidden="1" w:unhideWhenUsed="1"/>
+    <w:lsdException w:name="Plain Text" w:semiHidden="1" w:unhideWhenUsed="1"/>
+    <w:lsdException w:name="E-mail Signature" w:semiHidden="1" w:unhideWhenUsed="1"/>
+    <w:lsdException w:name="HTML Top of Form" w:semiHidden="1" w:unhideWhenUsed="1"/>
+    <w:lsdException w:name="HTML Bottom of Form" w:semiHidden="1" w:unhideWhenUsed="1"/>
+    <w:lsdException w:name="Normal (Web)" w:semiHidden="1" w:unhideWhenUsed="1"/>
+    <w:lsdException w:name="HTML Acronym" w:semiHidden="1" w:unhideWhenUsed="1"/>
+    <w:lsdException w:name="HTML Address" w:semiHidden="1" w:unhideWhenUsed="1"/>
+    <w:lsdException w:name="HTML Cite" w:semiHidden="1" w:unhideWhenUsed="1"/>
+    <w:lsdException w:name="HTML Code" w:semiHidden="1" w:unhideWhenUsed="1"/>
+    <w:lsdException w:name="HTML Definition" w:semiHidden="1" w:unhideWhenUsed="1"/>
+    <w:lsdException w:name="HTML Keyboard" w:semiHidden="1" w:unhideWhenUsed="1"/>
+    <w:lsdException w:name="HTML Preformatted" w:semiHidden="1" w:unhideWhenUsed="1"/>
+    <w:lsdException w:name="HTML Sample" w:semiHidden="1" w:unhideWhenUsed="1"/>
+    <w:lsdException w:name="HTML Typewriter" w:semiHidden="1" w:unhideWhenUsed="1"/>
+    <w:lsdException w:name="HTML Variable" w:semiHidden="1" w:unhideWhenUsed="1"/>
+    <w:lsdException w:name="Normal Table" w:semiHidden="1" w:unhideWhenUsed="1"/>
+    <w:lsdException w:name="annotation subject" w:semiHidden="1" w:unhideWhenUsed="1"/>
+    <w:lsdException w:name="No List" w:semiHidden="1" w:unhideWhenUsed="1"/>
+    <w:lsdException w:name="Outline List 1" w:semiHidden="1" w:unhideWhenUsed="1"/>
+    <w:lsdException w:name="Outline List 2" w:semiHidden="1" w:unhideWhenUsed="1"/>
+    <w:lsdException w:name="Outline List 3" w:semiHidden="1" w:unhideWhenUsed="1"/>
+    <w:lsdException w:name="Table Simple 1" w:semiHidden="1" w:unhideWhenUsed="1"/>
+    <w:lsdException w:name="Table Simple 2" w:semiHidden="1" w:unhideWhenUsed="1"/>
+    <w:lsdException w:name="Table Simple 3" w:semiHidden="1" w:unhideWhenUsed="1"/>
+    <w:lsdException w:name="Table Classic 1" w:semiHidden="1" w:unhideWhenUsed="1"/>
+    <w:lsdException w:name="Table Classic 2" w:semiHidden="1" w:unhideWhenUsed="1"/>
+    <w:lsdException w:name="Table Classic 3" w:semiHidden="1" w:unhideWhenUsed="1"/>
+    <w:lsdException w:name="Table Classic 4" w:semiHidden="1" w:unhideWhenUsed="1"/>
+    <w:lsdException w:name="Table Colorful 1" w:semiHidden="1" w:unhideWhenUsed="1"/>
+    <w:lsdException w:name="Table Colorful 2" w:semiHidden="1" w:unhideWhenUsed="1"/>
+    <w:lsdException w:name="Table Colorful 3" w:semiHidden="1" w:unhideWhenUsed="1"/>
+    <w:lsdException w:name="Table Columns 1" w:semiHidden="1" w:unhideWhenUsed="1"/>
+    <w:lsdException w:name="Table Columns 2" w:semiHidden="1" w:unhideWhenUsed="1"/>
+    <w:lsdException w:name="Table Columns 3" w:semiHidden="1" w:unhideWhenUsed="1"/>
+    <w:lsdException w:name="Table Columns 4" w:semiHidden="1" w:unhideWhenUsed="1"/>
+    <w:lsdException w:name="Table Columns 5" w:semiHidden="1" w:unhideWhenUsed="1"/>
+    <w:lsdException w:name="Table Grid 1" w:semiHidden="1" w:unhideWhenUsed="1"/>
+    <w:lsdException w:name="Table Grid 2" w:semiHidden="1" w:unhideWhenUsed="1"/>
+    <w:lsdException w:name="Table Grid 3" w:semiHidden="1" w:unhideWhenUsed="1"/>
+    <w:lsdException w:name="Table Grid 4" w:semiHidden="1" w:unhideWhenUsed="1"/>
+    <w:lsdException w:name="Table Grid 5" w:semiHidden="1" w:unhideWhenUsed="1"/>
+    <w:lsdException w:name="Table Grid 6" w:semiHidden="1" w:unhideWhenUsed="1"/>
+    <w:lsdException w:name="Table Grid 7" w:semiHidden="1" w:unhideWhenUsed="1"/>
+    <w:lsdException w:name="Table Grid 8" w:semiHidden="1" w:unhideWhenUsed="1"/>
+    <w:lsdException w:name="Table List 1" w:semiHidden="1" w:unhideWhenUsed="1"/>
+    <w:lsdException w:name="Table List 2" w:semiHidden="1" w:unhideWhenUsed="1"/>
+    <w:lsdException w:name="Table List 3" w:semiHidden="1" w:unhideWhenUsed="1"/>
+    <w:lsdException w:name="Table List 4" w:semiHidden="1" w:unhideWhenUsed="1"/>
+    <w:lsdException w:name="Table List 5" w:semiHidden="1" w:unhideWhenUsed="1"/>
+    <w:lsdException w:name="Table List 6" w:semiHidden="1" w:unhideWhenUsed="1"/>
+    <w:lsdException w:name="Table List 7" w:semiHidden="1" w:unhideWhenUsed="1"/>
+    <w:lsdException w:name="Table List 8" w:semiHidden="1" w:unhideWhenUsed="1"/>
+    <w:lsdException w:name="Table 3D effects 1" w:semiHidden="1" w:unhideWhenUsed="1"/>
+    <w:lsdException w:name="Table 3D effects 2" w:semiHidden="1" w:unhideWhenUsed="1"/>
+    <w:lsdException w:name="Table 3D effects 3" w:semiHidden="1" w:unhideWhenUsed="1"/>
+    <w:lsdException w:name="Table Contemporary" w:semiHidden="1" w:unhideWhenUsed="1"/>
+    <w:lsdException w:name="Table Elegant" w:semiHidden="1" w:unhideWhenUsed="1"/>
+    <w:lsdException w:name="Table Professional" w:semiHidden="1" w:unhideWhenUsed="1"/>
+    <w:lsdException w:name="Table Subtle 1" w:semiHidden="1" w:unhideWhenUsed="1"/>
+    <w:lsdException w:name="Table Subtle 2" w:semiHidden="1" w:unhideWhenUsed="1"/>
+    <w:lsdException w:name="Table Web 1" w:semiHidden="1" w:unhideWhenUsed="1"/>
+    <w:lsdException w:name="Table Web 2" w:semiHidden="1" w:unhideWhenUsed="1"/>
+    <w:lsdException w:name="Table Web 3" w:semiHidden="1" w:unhideWhenUsed="1"/>
+    <w:lsdException w:name="Balloon Text" w:semiHidden="1" w:unhideWhenUsed="1"/>
+    <w:lsdException w:name="Table Grid" w:uiPriority="39"/>
+    <w:lsdException w:name="Table Theme" w:semiHidden="1" w:unhideWhenUsed="1"/>
+    <w:lsdException w:name="Placeholder Text" w:semiHidden="1"/>
+    <w:lsdException w:name="No Spacing" w:uiPriority="1" w:qFormat="1"/>
+    <w:lsdException w:name="Light Shading" w:uiPriority="60"/>
+    <w:lsdException w:name="Light List" w:uiPriority="61"/>
+    <w:lsdException w:name="Light Grid" w:uiPriority="62"/>
+    <w:lsdException w:name="Medium Shading 1" w:uiPriority="63"/>
+    <w:lsdException w:name="Medium Shading 2" w:uiPriority="64"/>
+    <w:lsdException w:name="Medium List 1" w:uiPriority="65"/>
+    <w:lsdException w:name="Medium List 2" w:uiPriority="66"/>
+    <w:lsdException w:name="Medium Grid 1" w:uiPriority="67"/>
+    <w:lsdException w:name="Medium Grid 2" w:uiPriority="68"/>
+    <w:lsdException w:name="Medium Grid 3" w:uiPriority="69"/>
+    <w:lsdException w:name="Dark List" w:uiPriority="70"/>
+    <w:lsdException w:name="Colorful Shading" w:uiPriority="71"/>
+    <w:lsdException w:name="Colorful List" w:uiPriority="72"/>
+    <w:lsdException w:name="Colorful Grid" w:uiPriority="73"/>
+    <w:lsdException w:name="Light Shading Accent 1" w:uiPriority="60"/>
+    <w:lsdException w:name="Light List Accent 1" w:uiPriority="61"/>
+    <w:lsdException w:name="Light Grid Accent 1" w:uiPriority="62"/>
+    <w:lsdException w:name="Medium Shading 1 Accent 1" w:uiPriority="63"/>
+    <w:lsdException w:name="Medium Shading 2 Accent 1" w:uiPriority="64"/>
+    <w:lsdException w:name="Medium List 1 Accent 1" w:uiPriority="65"/>
+    <w:lsdException w:name="Revision" w:semiHidden="1"/>
+    <w:lsdException w:name="List Paragraph" w:uiPriority="34" w:qFormat="1"/>
+    <w:lsdException w:name="Quote" w:uiPriority="29" w:qFormat="1"/>
+    <w:lsdException w:name="Intense Quote" w:uiPriority="30" w:qFormat="1"/>
+    <w:lsdException w:name="Medium List 2 Accent 1" w:uiPriority="66"/>
+    <w:lsdException w:name="Medium Grid 1 Accent 1" w:uiPriority="67"/>
+    <w:lsdException w:name="Medium Grid 2 Accent 1" w:uiPriority="68"/>
+    <w:lsdException w:name="Medium Grid 3 Accent 1" w:uiPriority="69"/>
+    <w:lsdException w:name="Dark List Accent 1" w:uiPriority="70"/>
+    <w:lsdException w:name="Colorful Shading Accent 1" w:uiPriority="71"/>
+    <w:lsdException w:name="Colorful List Accent 1" w:uiPriority="72"/>
+    <w:lsdException w:name="Colorful Grid Accent 1" w:uiPriority="73"/>
+    <w:lsdException w:name="Light Shading Accent 2" w:uiPriority="60"/>
+    <w:lsdException w:name="Light List Accent 2" w:uiPriority="61"/>
+    <w:lsdException w:name="Light Grid Accent 2" w:uiPriority="62"/>
+    <w:lsdException w:name="Medium Shading 1 Accent 2" w:uiPriority="63"/>
+    <w:lsdException w:name="Medium Shading 2 Accent 2" w:uiPriority="64"/>
+    <w:lsdException w:name="Medium List 1 Accent 2" w:uiPriority="65"/>
+    <w:lsdException w:name="Medium List 2 Accent 2" w:uiPriority="66"/>
+    <w:lsdException w:name="Medium Grid 1 Accent 2" w:uiPriority="67"/>
+    <w:lsdException w:name="Medium Grid 2 Accent 2" w:uiPriority="68"/>
+    <w:lsdException w:name="Medium Grid 3 Accent 2" w:uiPriority="69"/>
+    <w:lsdException w:name="Dark List Accent 2" w:uiPriority="70"/>
+    <w:lsdException w:name="Colorful Shading Accent 2" w:uiPriority="71"/>
+    <w:lsdException w:name="Colorful List Accent 2" w:uiPriority="72"/>
+    <w:lsdException w:name="Colorful Grid Accent 2" w:uiPriority="73"/>
+    <w:lsdException w:name="Light Shading Accent 3" w:uiPriority="60"/>
+    <w:lsdException w:name="Light List Accent 3" w:uiPriority="61"/>
+    <w:lsdException w:name="Light Grid Accent 3" w:uiPriority="62"/>
+    <w:lsdException w:name="Medium Shading 1 Accent 3" w:uiPriority="63"/>
+    <w:lsdException w:name="Medium Shading 2 Accent 3" w:uiPriority="64"/>
+    <w:lsdException w:name="Medium List 1 Accent 3" w:uiPriority="65"/>
+    <w:lsdException w:name="Medium List 2 Accent 3" w:uiPriority="66"/>
+    <w:lsdException w:name="Medium Grid 1 Accent 3" w:uiPriority="67"/>
+    <w:lsdException w:name="Medium Grid 2 Accent 3" w:uiPriority="68"/>
+    <w:lsdException w:name="Medium Grid 3 Accent 3" w:uiPriority="69"/>
+    <w:lsdException w:name="Dark List Accent 3" w:uiPriority="70"/>
+    <w:lsdException w:name="Colorful Shading Accent 3" w:uiPriority="71"/>
+    <w:lsdException w:name="Colorful List Accent 3" w:uiPriority="72"/>
+    <w:lsdException w:name="Colorful Grid Accent 3" w:uiPriority="73"/>
+    <w:lsdException w:name="Light Shading Accent 4" w:uiPriority="60"/>
+    <w:lsdException w:name="Light List Accent 4" w:uiPriority="61"/>
+    <w:lsdException w:name="Light Grid Accent 4" w:uiPriority="62"/>
+    <w:lsdException w:name="Medium Shading 1 Accent 4" w:uiPriority="63"/>
+    <w:lsdException w:name="Medium Shading 2 Accent 4" w:uiPriority="64"/>
+    <w:lsdException w:name="Medium List 1 Accent 4" w:uiPriority="65"/>
+    <w:lsdException w:name="Medium List 2 Accent 4" w:uiPriority="66"/>
+    <w:lsdException w:name="Medium Grid 1 Accent 4" w:uiPriority="67"/>
+    <w:lsdException w:name="Medium Grid 2 Accent 4" w:uiPriority="68"/>
+    <w:lsdException w:name="Medium Grid 3 Accent 4" w:uiPriority="69"/>
+    <w:lsdException w:name="Dark List Accent 4" w:uiPriority="70"/>
+    <w:lsdException w:name="Colorful Shading Accent 4" w:uiPriority="71"/>
+    <w:lsdException w:name="Colorful List Accent 4" w:uiPriority="72"/>
+    <w:lsdException w:name="Colorful Grid Accent 4" w:uiPriority="73"/>
+    <w:lsdException w:name="Light Shading Accent 5" w:uiPriority="60"/>
+    <w:lsdException w:name="Light List Accent 5" w:uiPriority="61"/>
+    <w:lsdException w:name="Light Grid Accent 5" w:uiPriority="62"/>
+    <w:lsdException w:name="Medium Shading 1 Accent 5" w:uiPriority="63"/>
+    <w:lsdException w:name="Medium Shading 2 Accent 5" w:uiPriority="64"/>
+    <w:lsdException w:name="Medium List 1 Accent 5" w:uiPriority="65"/>
+    <w:lsdException w:name="Medium List 2 Accent 5" w:uiPriority="66"/>
+    <w:lsdException w:name="Medium Grid 1 Accent 5" w:uiPriority="67"/>
+    <w:lsdException w:name="Medium Grid 2 Accent 5" w:uiPriority="68"/>
+    <w:lsdException w:name="Medium Grid 3 Accent 5" w:uiPriority="69"/>
+    <w:lsdException w:name="Dark List Accent 5" w:uiPriority="70"/>
+    <w:lsdException w:name="Colorful Shading Accent 5" w:uiPriority="71"/>
+    <w:lsdException w:name="Colorful List Accent 5" w:uiPriority="72"/>
+    <w:lsdException w:name="Colorful Grid Accent 5" w:uiPriority="73"/>
+    <w:lsdException w:name="Light Shading Accent 6" w:uiPriority="60"/>
+    <w:lsdException w:name="Light List Accent 6" w:uiPriority="61"/>
+    <w:lsdException w:name="Light Grid Accent 6" w:uiPriority="62"/>
+    <w:lsdException w:name="Medium Shading 1 Accent 6" w:uiPriority="63"/>
+    <w:lsdException w:name="Medium Shading 2 Accent 6" w:uiPriority="64"/>
+    <w:lsdException w:name="Medium List 1 Accent 6" w:uiPriority="65"/>
+    <w:lsdException w:name="Medium List 2 Accent 6" w:uiPriority="66"/>
+    <w:lsdException w:name="Medium Grid 1 Accent 6" w:uiPriority="67"/>
+    <w:lsdException w:name="Medium Grid 2 Accent 6" w:uiPriority="68"/>
+    <w:lsdException w:name="Medium Grid 3 Accent 6" w:uiPriority="69"/>
+    <w:lsdException w:name="Dark List Accent 6" w:uiPriority="70"/>
+    <w:lsdException w:name="Colorful Shading Accent 6" w:uiPriority="71"/>
+    <w:lsdException w:name="Colorful List Accent 6" w:uiPriority="72"/>
+    <w:lsdException w:name="Colorful Grid Accent 6" w:uiPriority="73"/>
+    <w:lsdException w:name="Subtle Emphasis" w:uiPriority="19" w:qFormat="1"/>
+    <w:lsdException w:name="Intense Emphasis" w:uiPriority="21" w:qFormat="1"/>
+    <w:lsdException w:name="Subtle Reference" w:uiPriority="31" w:qFormat="1"/>
+    <w:lsdException w:name="Intense Reference" w:uiPriority="32" w:qFormat="1"/>
+    <w:lsdException w:name="Book Title" w:uiPriority="33" w:qFormat="1"/>
+    <w:lsdException w:name="Bibliography" w:semiHidden="1" w:uiPriority="37" w:unhideWhenUsed="1"/>
+    <w:lsdException w:name="TOC Heading" w:semiHidden="1" w:uiPriority="39" w:unhideWhenUsed="1" w:qFormat="1"/>
+    <w:lsdException w:name="Plain Table 1" w:uiPriority="41"/>
+    <w:lsdException w:name="Plain Table 2" w:uiPriority="42"/>
+    <w:lsdException w:name="Plain Table 3" w:uiPriority="43"/>
+    <w:lsdException w:name="Plain Table 4" w:uiPriority="44"/>
+    <w:lsdException w:name="Plain Table 5" w:uiPriority="45"/>
+    <w:lsdException w:name="Grid Table Light" w:uiPriority="40"/>
+    <w:lsdException w:name="Grid Table 1 Light" w:uiPriority="46"/>
+    <w:lsdException w:name="Grid Table 2" w:uiPriority="47"/>
+    <w:lsdException w:name="Grid Table 3" w:uiPriority="48"/>
+    <w:lsdException w:name="Grid Table 4" w:uiPriority="49"/>
+    <w:lsdException w:name="Grid Table 5 Dark" w:uiPriority="50"/>
+    <w:lsdException w:name="Grid Table 6 Colorful" w:uiPriority="51"/>
+    <w:lsdException w:name="Grid Table 7 Colorful" w:uiPriority="52"/>
+    <w:lsdException w:name="Grid Table 1 Light Accent 1" w:uiPriority="46"/>
+    <w:lsdException w:name="Grid Table 2 Accent 1" w:uiPriority="47"/>
+    <w:lsdException w:name="Grid Table 3 Accent 1" w:uiPriority="48"/>
+    <w:lsdException w:name="Grid Table 4 Accent 1" w:uiPriority="49"/>
+    <w:lsdException w:name="Grid Table 5 Dark Accent 1" w:uiPriority="50"/>
+    <w:lsdException w:name="Grid Table 6 Colorful Accent 1" w:uiPriority="51"/>
+    <w:lsdException w:name="Grid Table 7 Colorful Accent 1" w:uiPriority="52"/>
+    <w:lsdException w:name="Grid Table 1 Light Accent 2" w:uiPriority="46"/>
+    <w:lsdException w:name="Grid Table 2 Accent 2" w:uiPriority="47"/>
+    <w:lsdException w:name="Grid Table 3 Accent 2" w:uiPriority="48"/>
+    <w:lsdException w:name="Grid Table 4 Accent 2" w:uiPriority="49"/>
+    <w:lsdException w:name="Grid Table 5 Dark Accent 2" w:uiPriority="50"/>
+    <w:lsdException w:name="Grid Table 6 Colorful Accent 2" w:uiPriority="51"/>
+    <w:lsdException w:name="Grid Table 7 Colorful Accent 2" w:uiPriority="52"/>
+    <w:lsdException w:name="Grid Table 1 Light Accent 3" w:uiPriority="46"/>
+    <w:lsdException w:name="Grid Table 2 Accent 3" w:uiPriority="47"/>
+    <w:lsdException w:name="Grid Table 3 Accent 3" w:uiPriority="48"/>
+    <w:lsdException w:name="Grid Table 4 Accent 3" w:uiPriority="49"/>
+    <w:lsdException w:name="Grid Table 5 Dark Accent 3" w:uiPriority="50"/>
+    <w:lsdException w:name="Grid Table 6 Colorful Accent 3" w:uiPriority="51"/>
+    <w:lsdException w:name="Grid Table 7 Colorful Accent 3" w:uiPriority="52"/>
+    <w:lsdException w:name="Grid Table 1 Light Accent 4" w:uiPriority="46"/>
+    <w:lsdException w:name="Grid Table 2 Accent 4" w:uiPriority="47"/>
+    <w:lsdException w:name="Grid Table 3 Accent 4" w:uiPriority="48"/>
+    <w:lsdException w:name="Grid Table 4 Accent 4" w:uiPriority="49"/>
+    <w:lsdException w:name="Grid Table 5 Dark Accent 4" w:uiPriority="50"/>
+    <w:lsdException w:name="Grid Table 6 Colorful Accent 4" w:uiPriority="51"/>
+    <w:lsdException w:name="Grid Table 7 Colorful Accent 4" w:uiPriority="52"/>
+    <w:lsdException w:name="Grid Table 1 Light Accent 5" w:uiPriority="46"/>
+    <w:lsdException w:name="Grid Table 2 Accent 5" w:uiPriority="47"/>
+    <w:lsdException w:name="Grid Table 3 Accent 5" w:uiPriority="48"/>
+    <w:lsdException w:name="Grid Table 4 Accent 5" w:uiPriority="49"/>
+    <w:lsdException w:name="Grid Table 5 Dark Accent 5" w:uiPriority="50"/>
+    <w:lsdException w:name="Grid Table 6 Colorful Accent 5" w:uiPriority="51"/>
+    <w:lsdException w:name="Grid Table 7 Colorful Accent 5" w:uiPriority="52"/>
+    <w:lsdException w:name="Grid Table 1 Light Accent 6" w:uiPriority="46"/>
+    <w:lsdException w:name="Grid Table 2 Accent 6" w:uiPriority="47"/>
+    <w:lsdException w:name="Grid Table 3 Accent 6" w:uiPriority="48"/>
+    <w:lsdException w:name="Grid Table 4 Accent 6" w:uiPriority="49"/>
+    <w:lsdException w:name="Grid Table 5 Dark Accent 6" w:uiPriority="50"/>
+    <w:lsdException w:name="Grid Table 6 Colorful Accent 6" w:uiPriority="51"/>
+    <w:lsdException w:name="Grid Table 7 Colorful Accent 6" w:uiPriority="52"/>
+    <w:lsdException w:name="List Table 1 Light" w:uiPriority="46"/>
+    <w:lsdException w:name="List Table 2" w:uiPriority="47"/>
+    <w:lsdException w:name="List Table 3" w:uiPriority="48"/>
+    <w:lsdException w:name="List Table 4" w:uiPriority="49"/>
+    <w:lsdException w:name="List Table 5 Dark" w:uiPriority="50"/>
+    <w:lsdException w:name="List Table 6 Colorful" w:uiPriority="51"/>
+    <w:lsdException w:name="List Table 7 Colorful" w:uiPriority="52"/>
+    <w:lsdException w:name="List Table 1 Light Accent 1" w:uiPriority="46"/>
+    <w:lsdException w:name="List Table 2 Accent 1" w:uiPriority="47"/>
+    <w:lsdException w:name="List Table 3 Accent 1" w:uiPriority="48"/>
+    <w:lsdException w:name="List Table 4 Accent 1" w:uiPriority="49"/>
+    <w:lsdException w:name="List Table 5 Dark Accent 1" w:uiPriority="50"/>
+    <w:lsdException w:name="List Table 6 Colorful Accent 1" w:uiPriority="51"/>
+    <w:lsdException w:name="List Table 7 Colorful Accent 1" w:uiPriority="52"/>
+    <w:lsdException w:name="List Table 1 Light Accent 2" w:uiPriority="46"/>
+    <w:lsdException w:name="List Table 2 Accent 2" w:uiPriority="47"/>
+    <w:lsdException w:name="List Table 3 Accent 2" w:uiPriority="48"/>
+    <w:lsdException w:name="List Table 4 Accent 2" w:uiPriority="49"/>
+    <w:lsdException w:name="List Table 5 Dark Accent 2" w:uiPriority="50"/>
+    <w:lsdException w:name="List Table 6 Colorful Accent 2" w:uiPriority="51"/>
+    <w:lsdException w:name="List Table 7 Colorful Accent 2" w:uiPriority="52"/>
+    <w:lsdException w:name="List Table 1 Light Accent 3" w:uiPriority="46"/>
+    <w:lsdException w:name="List Table 2 Accent 3" w:uiPriority="47"/>
+    <w:lsdException w:name="List Table 3 Accent 3" w:uiPriority="48"/>
+    <w:lsdException w:name="List Table 4 Accent 3" w:uiPriority="49"/>
+    <w:lsdException w:name="List Table 5 Dark Accent 3" w:uiPriority="50"/>
+    <w:lsdException w:name="List Table 6 Colorful Accent 3" w:uiPriority="51"/>
+    <w:lsdException w:name="List Table 7 Colorful Accent 3" w:uiPriority="52"/>
+    <w:lsdException w:name="List Table 1 Light Accent 4" w:uiPriority="46"/>
+    <w:lsdException w:name="List Table 2 Accent 4" w:uiPriority="47"/>
+    <w:lsdException w:name="List Table 3 Accent 4" w:uiPriority="48"/>
+    <w:lsdException w:name="List Table 4 Accent 4" w:uiPriority="49"/>
+    <w:lsdException w:name="List Table 5 Dark Accent 4" w:uiPriority="50"/>
+    <w:lsdException w:name="List Table 6 Colorful Accent 4" w:uiPriority="51"/>
+    <w:lsdException w:name="List Table 7 Colorful Accent 4" w:uiPriority="52"/>
+    <w:lsdException w:name="List Table 1 Light Accent 5" w:uiPriority="46"/>
+    <w:lsdException w:name="List Table 2 Accent 5" w:uiPriority="47"/>
+    <w:lsdException w:name="List Table 3 Accent 5" w:uiPriority="48"/>
+    <w:lsdException w:name="List Table 4 Accent 5" w:uiPriority="49"/>
+    <w:lsdException w:name="List Table 5 Dark Accent 5" w:uiPriority="50"/>
+    <w:lsdException w:name="List Table 6 Colorful Accent 5" w:uiPriority="51"/>
+    <w:lsdException w:name="List Table 7 Colorful Accent 5" w:uiPriority="52"/>
+    <w:lsdException w:name="List Table 1 Light Accent 6" w:uiPriority="46"/>
+    <w:lsdException w:name="List Table 2 Accent 6" w:uiPriority="47"/>
+    <w:lsdException w:name="List Table 3 Accent 6" w:uiPriority="48"/>
+    <w:lsdException w:name="List Table 4 Accent 6" w:uiPriority="49"/>
+    <w:lsdException w:name="List Table 5 Dark Accent 6" w:uiPriority="50"/>
+    <w:lsdException w:name="List Table 6 Colorful Accent 6" w:uiPriority="51"/>
+    <w:lsdException w:name="List Table 7 Colorful Accent 6" w:uiPriority="52"/>
+  </w:latentStyles>
+  <w:style w:type="paragraph" w:default="1" w:styleId="Normal">
+    <w:name w:val="Normal"/>
+    <w:qFormat/>
+  </w:style>
+  <w:style w:type="paragraph" w:styleId="Titre1">
+    <w:name w:val="heading 1"/>
+    <w:basedOn w:val="Normal"/>
+    <w:next w:val="Normal"/>
+    <w:link w:val="Titre1Car"/>
+    <w:uiPriority w:val="9"/>
+    <w:qFormat/>
+    <w:rsid w:val="00620276"/>
+    <w:pPr>
+      <w:keepNext/>
+      <w:keepLines/>
+      <w:spacing w:before="240" w:after="0"/>
+      <w:outlineLvl w:val="0"/>
+    </w:pPr>
+    <w:rPr>
+      <w:rFonts w:asciiTheme="majorHAnsi" w:eastAsiaTheme="majorEastAsia" w:hAnsiTheme="majorHAnsi" w:cstheme="majorBidi"/>
+      <w:color w:val="2E74B5" w:themeColor="accent1" w:themeShade="BF"/>
+      <w:sz w:val="32"/>
+      <w:szCs w:val="32"/>
+    </w:rPr>
+  </w:style>
+  <w:style w:type="character" w:default="1" w:styleId="Policepardfaut">
+    <w:name w:val="Default Paragraph Font"/>
+    <w:uiPriority w:val="1"/>
+    <w:semiHidden/>
+    <w:unhideWhenUsed/>
+  </w:style>
+  <w:style w:type="table" w:default="1" w:styleId="TableauNormal">
+    <w:name w:val="Normal Table"/>
+    <w:uiPriority w:val="99"/>
+    <w:semiHidden/>
+    <w:unhideWhenUsed/>
+    <w:tblPr>
+      <w:tblInd w:w="0" w:type="dxa"/>
+      <w:tblCellMar>
+        <w:top w:w="0" w:type="dxa"/>
+        <w:left w:w="108" w:type="dxa"/>
+        <w:bottom w:w="0" w:type="dxa"/>
+        <w:right w:w="108" w:type="dxa"/>
+      </w:tblCellMar>
+    </w:tblPr>
+  </w:style>
+  <w:style w:type="numbering" w:default="1" w:styleId="Aucuneliste">
+    <w:name w:val="No List"/>
+    <w:uiPriority w:val="99"/>
+    <w:semiHidden/>
+    <w:unhideWhenUsed/>
+  </w:style>
+  <w:style w:type="paragraph" w:styleId="Paragraphedeliste">
+    <w:name w:val="List Paragraph"/>
+    <w:basedOn w:val="Normal"/>
+    <w:uiPriority w:val="34"/>
+    <w:qFormat/>
+    <w:rsid w:val="00435D6C"/>
+    <w:pPr>
+      <w:ind w:left="720"/>
+      <w:contextualSpacing/>
+    </w:pPr>
+  </w:style>
+  <w:style w:type="paragraph" w:styleId="En-tte">
+    <w:name w:val="header"/>
+    <w:basedOn w:val="Normal"/>
+    <w:link w:val="En-tteCar"/>
+    <w:uiPriority w:val="99"/>
+    <w:unhideWhenUsed/>
+    <w:rsid w:val="00FB0197"/>
+    <w:pPr>
+      <w:tabs>
+        <w:tab w:val="center" w:pos="4680"/>
+        <w:tab w:val="right" w:pos="9360"/>
+      </w:tabs>
+      <w:spacing w:after="0" w:line="240" w:lineRule="auto"/>
+    </w:pPr>
+  </w:style>
+  <w:style w:type="character" w:customStyle="1" w:styleId="En-tteCar">
+    <w:name w:val="En-tête Car"/>
+    <w:basedOn w:val="Policepardfaut"/>
+    <w:link w:val="En-tte"/>
+    <w:uiPriority w:val="99"/>
+    <w:rsid w:val="00FB0197"/>
+  </w:style>
+  <w:style w:type="paragraph" w:styleId="Pieddepage">
+    <w:name w:val="footer"/>
+    <w:basedOn w:val="Normal"/>
+    <w:link w:val="PieddepageCar"/>
+    <w:uiPriority w:val="99"/>
+    <w:unhideWhenUsed/>
+    <w:rsid w:val="00FB0197"/>
+    <w:pPr>
+      <w:tabs>
+        <w:tab w:val="center" w:pos="4680"/>
+        <w:tab w:val="right" w:pos="9360"/>
+      </w:tabs>
+      <w:spacing w:after="0" w:line="240" w:lineRule="auto"/>
+    </w:pPr>
+  </w:style>
+  <w:style w:type="character" w:customStyle="1" w:styleId="PieddepageCar">
+    <w:name w:val="Pied de page Car"/>
+    <w:basedOn w:val="Policepardfaut"/>
+    <w:link w:val="Pieddepage"/>
+    <w:uiPriority w:val="99"/>
+    <w:rsid w:val="00FB0197"/>
+  </w:style>
+  <w:style w:type="table" w:styleId="Grilledutableau">
+    <w:name w:val="Table Grid"/>
+    <w:basedOn w:val="TableauNormal"/>
+    <w:uiPriority w:val="39"/>
+    <w:rsid w:val="00723FE8"/>
+    <w:pPr>
+      <w:spacing w:after="0" w:line="240" w:lineRule="auto"/>
+    </w:pPr>
+    <w:tblPr>
+      <w:tblBorders>
+        <w:top w:val="single" w:sz="4" w:space="0" w:color="auto"/>
+        <w:left w:val="single" w:sz="4" w:space="0" w:color="auto"/>
+        <w:bottom w:val="single" w:sz="4" w:space="0" w:color="auto"/>
+        <w:right w:val="single" w:sz="4" w:space="0" w:color="auto"/>
+        <w:insideH w:val="single" w:sz="4" w:space="0" w:color="auto"/>
+        <w:insideV w:val="single" w:sz="4" w:space="0" w:color="auto"/>
+      </w:tblBorders>
+    </w:tblPr>
+  </w:style>
+  <w:style w:type="character" w:customStyle="1" w:styleId="Titre1Car">
+    <w:name w:val="Titre 1 Car"/>
+    <w:basedOn w:val="Policepardfaut"/>
+    <w:link w:val="Titre1"/>
+    <w:uiPriority w:val="9"/>
+    <w:rsid w:val="00620276"/>
+    <w:rPr>
+      <w:rFonts w:asciiTheme="majorHAnsi" w:eastAsiaTheme="majorEastAsia" w:hAnsiTheme="majorHAnsi" w:cstheme="majorBidi"/>
+      <w:color w:val="2E74B5" w:themeColor="accent1" w:themeShade="BF"/>
+      <w:sz w:val="32"/>
+      <w:szCs w:val="32"/>
+    </w:rPr>
+  </w:style>
+  <w:style w:type="paragraph" w:styleId="En-ttedetabledesmatires">
+    <w:name w:val="TOC Heading"/>
+    <w:basedOn w:val="Titre1"/>
+    <w:next w:val="Normal"/>
+    <w:uiPriority w:val="39"/>
+    <w:unhideWhenUsed/>
+    <w:qFormat/>
+    <w:rsid w:val="00620276"/>
+    <w:pPr>
+      <w:outlineLvl w:val="9"/>
+    </w:pPr>
+  </w:style>
+  <w:style w:type="paragraph" w:styleId="TM2">
+    <w:name w:val="toc 2"/>
+    <w:basedOn w:val="Normal"/>
+    <w:next w:val="Normal"/>
+    <w:autoRedefine/>
+    <w:uiPriority w:val="39"/>
+    <w:unhideWhenUsed/>
+    <w:rsid w:val="00620276"/>
+    <w:pPr>
+      <w:spacing w:after="100"/>
+      <w:ind w:left="220"/>
+    </w:pPr>
+    <w:rPr>
+      <w:rFonts w:eastAsiaTheme="minorEastAsia" w:cs="Times New Roman"/>
+    </w:rPr>
+  </w:style>
+  <w:style w:type="paragraph" w:styleId="TM1">
+    <w:name w:val="toc 1"/>
+    <w:basedOn w:val="Normal"/>
+    <w:next w:val="Normal"/>
+    <w:autoRedefine/>
+    <w:uiPriority w:val="39"/>
+    <w:unhideWhenUsed/>
+    <w:rsid w:val="00620276"/>
+    <w:pPr>
+      <w:spacing w:after="100"/>
+    </w:pPr>
+    <w:rPr>
+      <w:rFonts w:eastAsiaTheme="minorEastAsia" w:cs="Times New Roman"/>
+    </w:rPr>
+  </w:style>
+  <w:style w:type="paragraph" w:styleId="TM3">
+    <w:name w:val="toc 3"/>
+    <w:basedOn w:val="Normal"/>
+    <w:next w:val="Normal"/>
+    <w:autoRedefine/>
+    <w:uiPriority w:val="39"/>
+    <w:unhideWhenUsed/>
+    <w:rsid w:val="00620276"/>
+    <w:pPr>
+      <w:spacing w:after="100"/>
+      <w:ind w:left="440"/>
+    </w:pPr>
+    <w:rPr>
+      <w:rFonts w:eastAsiaTheme="minorEastAsia" w:cs="Times New Roman"/>
+    </w:rPr>
+  </w:style>
+</w:styles>
+</file>
+
+<file path=word/glossary/document.xml><?xml version="1.0" encoding="utf-8"?>
+<w:glossaryDocument xmlns:wpc="http://schemas.microsoft.com/office/word/2010/wordprocessingCanvas" xmlns:cx="http://schemas.microsoft.com/office/drawing/2014/chartex" xmlns:mc="http://schemas.openxmlformats.org/markup-compatibility/2006" xmlns:o="urn:schemas-microsoft-com:office:office" xmlns:r="http://schemas.openxmlformats.org/officeDocument/2006/relationships" xmlns:m="http://schemas.openxmlformats.org/officeDocument/2006/math" xmlns:v="urn:schemas-microsoft-com:vml" xmlns:wp14="http://schemas.microsoft.com/office/word/2010/wordprocessingDrawing" xmlns:wp="http://schemas.openxmlformats.org/drawingml/2006/wordprocessingDrawing" xmlns:w10="urn:schemas-microsoft-com:office:word" xmlns:w="http://schemas.openxmlformats.org/wordprocessingml/2006/main" xmlns:w14="http://schemas.microsoft.com/office/word/2010/wordml" xmlns:w15="http://schemas.microsoft.com/office/word/2012/wordml" xmlns:w16se="http://schemas.microsoft.com/office/word/2015/wordml/symex" xmlns:wpg="http://schemas.microsoft.com/office/word/2010/wordprocessingGroup" xmlns:wpi="http://schemas.microsoft.com/office/word/2010/wordprocessingInk" xmlns:wne="http://schemas.microsoft.com/office/word/2006/wordml" xmlns:wps="http://schemas.microsoft.com/office/word/2010/wordprocessingShape" mc:Ignorable="w14 w15 w16se wp14"/>
+</file>
+
+<file path=word/glossary/fontTable.xml><?xml version="1.0" encoding="utf-8"?>
+<w:fonts xmlns:mc="http://schemas.openxmlformats.org/markup-compatibility/2006" xmlns:r="http://schemas.openxmlformats.org/officeDocument/2006/relationships" xmlns:w="http://schemas.openxmlformats.org/wordprocessingml/2006/main" xmlns:w14="http://schemas.microsoft.com/office/word/2010/wordml" xmlns:w15="http://schemas.microsoft.com/office/word/2012/wordml" xmlns:w16se="http://schemas.microsoft.com/office/word/2015/wordml/symex" mc:Ignorable="w14 w15 w16se">
+  <w:font w:name="Wingdings">
+    <w:panose1 w:val="05000000000000000000"/>
+    <w:charset w:val="02"/>
+    <w:family w:val="auto"/>
+    <w:pitch w:val="variable"/>
+    <w:sig w:usb0="00000000" w:usb1="10000000" w:usb2="00000000" w:usb3="00000000" w:csb0="80000000" w:csb1="00000000"/>
+  </w:font>
+  <w:font w:name="Times New Roman">
+    <w:panose1 w:val="02020603050405020304"/>
+    <w:charset w:val="00"/>
+    <w:family w:val="roman"/>
+    <w:pitch w:val="variable"/>
+    <w:sig w:usb0="E0002AFF" w:usb1="C0007841" w:usb2="00000009" w:usb3="00000000" w:csb0="000001FF" w:csb1="00000000"/>
+  </w:font>
+  <w:font w:name="Courier New">
+    <w:panose1 w:val="02070309020205020404"/>
+    <w:charset w:val="00"/>
+    <w:family w:val="modern"/>
+    <w:pitch w:val="fixed"/>
+    <w:sig w:usb0="E0002EFF" w:usb1="C0007843" w:usb2="00000009" w:usb3="00000000" w:csb0="000001FF" w:csb1="00000000"/>
+  </w:font>
+  <w:font w:name="Symbol">
+    <w:panose1 w:val="05050102010706020507"/>
+    <w:charset w:val="02"/>
+    <w:family w:val="roman"/>
+    <w:pitch w:val="variable"/>
+    <w:sig w:usb0="00000000" w:usb1="10000000" w:usb2="00000000" w:usb3="00000000" w:csb0="80000000" w:csb1="00000000"/>
+  </w:font>
+  <w:font w:name="Calibri">
+    <w:panose1 w:val="020F0502020204030204"/>
+    <w:charset w:val="00"/>
+    <w:family w:val="swiss"/>
+    <w:pitch w:val="variable"/>
+    <w:sig w:usb0="E0002AFF" w:usb1="4000ACFF" w:usb2="00000001" w:usb3="00000000" w:csb0="000001FF" w:csb1="00000000"/>
+  </w:font>
+  <w:font w:name="Calibri Light">
+    <w:panose1 w:val="020F0302020204030204"/>
+    <w:charset w:val="00"/>
+    <w:family w:val="swiss"/>
+    <w:pitch w:val="variable"/>
+    <w:sig w:usb0="A0002AEF" w:usb1="4000207B" w:usb2="00000000" w:usb3="00000000" w:csb0="000001FF" w:csb1="00000000"/>
+  </w:font>
+</w:fonts>
+</file>
+
+<file path=word/glossary/settings.xml><?xml version="1.0" encoding="utf-8"?>
+<w:settings xmlns:mc="http://schemas.openxmlformats.org/markup-compatibility/2006" xmlns:o="urn:schemas-microsoft-com:office:office" xmlns:r="http://schemas.openxmlformats.org/officeDocument/2006/relationships" xmlns:m="http://schemas.openxmlformats.org/officeDocument/2006/math" xmlns:v="urn:schemas-microsoft-com:vml" xmlns:w10="urn:schemas-microsoft-com:office:word" xmlns:w="http://schemas.openxmlformats.org/wordprocessingml/2006/main" xmlns:w14="http://schemas.microsoft.com/office/word/2010/wordml" xmlns:w15="http://schemas.microsoft.com/office/word/2012/wordml" xmlns:w16se="http://schemas.microsoft.com/office/word/2015/wordml/symex" xmlns:sl="http://schemas.openxmlformats.org/schemaLibrary/2006/main" mc:Ignorable="w14 w15 w16se">
+  <w:view w:val="normal"/>
+  <w:defaultTabStop w:val="720"/>
+  <w:characterSpacingControl w:val="doNotCompress"/>
+  <w:compat>
+    <w:useFELayout/>
+    <w:compatSetting w:name="compatibilityMode" w:uri="http://schemas.microsoft.com/office/word" w:val="15"/>
+    <w:compatSetting w:name="overrideTableStyleFontSizeAndJustification" w:uri="http://schemas.microsoft.com/office/word" w:val="1"/>
+    <w:compatSetting w:name="enableOpenTypeFeatures" w:uri="http://schemas.microsoft.com/office/word" w:val="1"/>
+    <w:compatSetting w:name="doNotFlipMirrorIndents" w:uri="http://schemas.microsoft.com/office/word" w:val="1"/>
+    <w:compatSetting w:name="differentiateMultirowTableHeaders" w:uri="http://schemas.microsoft.com/office/word" w:val="1"/>
+  </w:compat>
+  <w:rsids>
+    <w:rsidRoot w:val="00B64597"/>
+    <w:rsid w:val="00B64597"/>
+    <w:rsid w:val="00D72883"/>
+  </w:rsids>
+  <m:mathPr>
+    <m:mathFont m:val="Cambria Math"/>
+    <m:brkBin m:val="before"/>
+    <m:brkBinSub m:val="--"/>
+    <m:smallFrac m:val="0"/>
+    <m:dispDef/>
+    <m:lMargin m:val="0"/>
+    <m:rMargin m:val="0"/>
+    <m:defJc m:val="centerGroup"/>
+    <m:wrapIndent m:val="1440"/>
+    <m:intLim m:val="subSup"/>
+    <m:naryLim m:val="undOvr"/>
+  </m:mathPr>
+  <w:themeFontLang w:val="en-US"/>
+  <w:clrSchemeMapping w:bg1="light1" w:t1="dark1" w:bg2="light2" w:t2="dark2" w:accent1="accent1" w:accent2="accent2" w:accent3="accent3" w:accent4="accent4" w:accent5="accent5" w:accent6="accent6" w:hyperlink="hyperlink" w:followedHyperlink="followedHyperlink"/>
+  <w:decimalSymbol w:val="."/>
+  <w:listSeparator w:val=","/>
+  <w15:chartTrackingRefBased/>
+</w:settings>
+</file>
+
+<file path=word/glossary/styles.xml><?xml version="1.0" encoding="utf-8"?>
+<w:styles xmlns:mc="http://schemas.openxmlformats.org/markup-compatibility/2006" xmlns:r="http://schemas.openxmlformats.org/officeDocument/2006/relationships" xmlns:w="http://schemas.openxmlformats.org/wordprocessingml/2006/main" xmlns:w14="http://schemas.microsoft.com/office/word/2010/wordml" xmlns:w15="http://schemas.microsoft.com/office/word/2012/wordml" xmlns:w16se="http://schemas.microsoft.com/office/word/2015/wordml/symex" mc:Ignorable="w14 w15 w16se">
+  <w:docDefaults>
+    <w:rPrDefault>
+      <w:rPr>
+        <w:rFonts w:asciiTheme="minorHAnsi" w:eastAsiaTheme="minorEastAsia" w:hAnsiTheme="minorHAnsi" w:cstheme="minorBidi"/>
         <w:sz w:val="22"/>
         <w:szCs w:val="22"/>
         <w:lang w:val="en-US" w:eastAsia="en-US" w:bidi="ar-SA"/>
@@ -3319,81 +3581,38 @@
     <w:semiHidden/>
     <w:unhideWhenUsed/>
   </w:style>
-  <w:style w:type="paragraph" w:styleId="Paragraphedeliste">
-    <w:name w:val="List Paragraph"/>
-    <w:basedOn w:val="Normal"/>
-    <w:uiPriority w:val="34"/>
-    <w:qFormat/>
-    <w:rsid w:val="00435D6C"/>
-    <w:pPr>
-      <w:ind w:left="720"/>
-      <w:contextualSpacing/>
-    </w:pPr>
+  <w:style w:type="paragraph" w:customStyle="1" w:styleId="954ED7EB080246BEBD32B4B6A04D4C09">
+    <w:name w:val="954ED7EB080246BEBD32B4B6A04D4C09"/>
+    <w:rsid w:val="00B64597"/>
   </w:style>
-  <w:style w:type="paragraph" w:styleId="En-tte">
-    <w:name w:val="header"/>
-    <w:basedOn w:val="Normal"/>
-    <w:link w:val="En-tteCar"/>
-    <w:uiPriority w:val="99"/>
-    <w:unhideWhenUsed/>
-    <w:rsid w:val="00FB0197"/>
-    <w:pPr>
-      <w:tabs>
-        <w:tab w:val="center" w:pos="4680"/>
-        <w:tab w:val="right" w:pos="9360"/>
-      </w:tabs>
-      <w:spacing w:after="0" w:line="240" w:lineRule="auto"/>
-    </w:pPr>
+  <w:style w:type="paragraph" w:customStyle="1" w:styleId="B1F99DE71BFF42C9BA9C72641CE3E4CC">
+    <w:name w:val="B1F99DE71BFF42C9BA9C72641CE3E4CC"/>
+    <w:rsid w:val="00B64597"/>
   </w:style>
-  <w:style w:type="character" w:customStyle="1" w:styleId="En-tteCar">
-    <w:name w:val="En-tête Car"/>
-    <w:basedOn w:val="Policepardfaut"/>
-    <w:link w:val="En-tte"/>
-    <w:uiPriority w:val="99"/>
-    <w:rsid w:val="00FB0197"/>
+  <w:style w:type="paragraph" w:customStyle="1" w:styleId="2226410BACD9443EA41F0A66DA8F23B8">
+    <w:name w:val="2226410BACD9443EA41F0A66DA8F23B8"/>
+    <w:rsid w:val="00B64597"/>
   </w:style>
-  <w:style w:type="paragraph" w:styleId="Pieddepage">
-    <w:name w:val="footer"/>
-    <w:basedOn w:val="Normal"/>
-    <w:link w:val="PieddepageCar"/>
-    <w:uiPriority w:val="99"/>
-    <w:unhideWhenUsed/>
-    <w:rsid w:val="00FB0197"/>
-    <w:pPr>
-      <w:tabs>
-        <w:tab w:val="center" w:pos="4680"/>
-        <w:tab w:val="right" w:pos="9360"/>
-      </w:tabs>
-      <w:spacing w:after="0" w:line="240" w:lineRule="auto"/>
-    </w:pPr>
+  <w:style w:type="paragraph" w:customStyle="1" w:styleId="CB72A4DF03314B68A29CCCC579C83FFE">
+    <w:name w:val="CB72A4DF03314B68A29CCCC579C83FFE"/>
+    <w:rsid w:val="00B64597"/>
   </w:style>
-  <w:style w:type="character" w:customStyle="1" w:styleId="PieddepageCar">
-    <w:name w:val="Pied de page Car"/>
-    <w:basedOn w:val="Policepardfaut"/>
-    <w:link w:val="Pieddepage"/>
-    <w:uiPriority w:val="99"/>
-    <w:rsid w:val="00FB0197"/>
+  <w:style w:type="paragraph" w:customStyle="1" w:styleId="D901E6A7B83A489593ED689EC258A6F3">
+    <w:name w:val="D901E6A7B83A489593ED689EC258A6F3"/>
+    <w:rsid w:val="00B64597"/>
   </w:style>
-  <w:style w:type="table" w:styleId="Grilledutableau">
-    <w:name w:val="Table Grid"/>
-    <w:basedOn w:val="TableauNormal"/>
-    <w:uiPriority w:val="39"/>
-    <w:rsid w:val="00723FE8"/>
-    <w:pPr>
-      <w:spacing w:after="0" w:line="240" w:lineRule="auto"/>
-    </w:pPr>
-    <w:tblPr>
-      <w:tblBorders>
-        <w:top w:val="single" w:sz="4" w:space="0" w:color="auto"/>
-        <w:left w:val="single" w:sz="4" w:space="0" w:color="auto"/>
-        <w:bottom w:val="single" w:sz="4" w:space="0" w:color="auto"/>
-        <w:right w:val="single" w:sz="4" w:space="0" w:color="auto"/>
-        <w:insideH w:val="single" w:sz="4" w:space="0" w:color="auto"/>
-        <w:insideV w:val="single" w:sz="4" w:space="0" w:color="auto"/>
-      </w:tblBorders>
-    </w:tblPr>
+  <w:style w:type="paragraph" w:customStyle="1" w:styleId="5A9CEF60150640AB9813D14F71513819">
+    <w:name w:val="5A9CEF60150640AB9813D14F71513819"/>
+    <w:rsid w:val="00B64597"/>
   </w:style>
 </w:styles>
+</file>
+
+<file path=word/glossary/webSettings.xml><?xml version="1.0" encoding="utf-8"?>
+<w:webSettings xmlns:mc="http://schemas.openxmlformats.org/markup-compatibility/2006" xmlns:r="http://schemas.openxmlformats.org/officeDocument/2006/relationships" xmlns:w="http://schemas.openxmlformats.org/wordprocessingml/2006/main" xmlns:w14="http://schemas.microsoft.com/office/word/2010/wordml" xmlns:w15="http://schemas.microsoft.com/office/word/2012/wordml" xmlns:w16se="http://schemas.microsoft.com/office/word/2015/wordml/symex" mc:Ignorable="w14 w15 w16se">
+  <w:optimizeForBrowser/>
+  <w:allowPNG/>
+</w:webSettings>
 </file>
 
 <file path=word/theme/theme1.xml><?xml version="1.0" encoding="utf-8"?>
@@ -3655,4 +3874,16 @@
     </a:ext>
   </a:extLst>
 </a:theme>
+</file>
+
+<file path=customXml/item1.xml><?xml version="1.0" encoding="utf-8"?>
+<b:Sources xmlns:b="http://schemas.openxmlformats.org/officeDocument/2006/bibliography" xmlns="http://schemas.openxmlformats.org/officeDocument/2006/bibliography" SelectedStyle="\APASixthEditionOfficeOnline.xsl" StyleName="APA" Version="6"/>
+</file>
+
+<file path=customXml/itemProps1.xml><?xml version="1.0" encoding="utf-8"?>
+<ds:datastoreItem xmlns:ds="http://schemas.openxmlformats.org/officeDocument/2006/customXml" ds:itemID="{66254321-53AA-4A8A-A3D4-97F5163481D0}">
+  <ds:schemaRefs>
+    <ds:schemaRef ds:uri="http://schemas.openxmlformats.org/officeDocument/2006/bibliography"/>
+  </ds:schemaRefs>
+</ds:datastoreItem>
 </file>
</xml_diff>